<commit_message>
Réglage de petit soucis dans le chargement et le zoom
</commit_message>
<xml_diff>
--- a/rapport_stage_m2_soitel_remi.docx
+++ b/rapport_stage_m2_soitel_remi.docx
@@ -1271,7 +1271,7 @@
           <w:r>
             <w:fldChar w:fldCharType="separate"/>
           </w:r>
-          <w:hyperlink w:anchor="_Toc230270965" w:history="1">
+          <w:hyperlink w:anchor="_Toc230338106" w:history="1">
             <w:r>
               <w:rPr>
                 <w:rStyle w:val="Lienhypertexte"/>
@@ -1317,7 +1317,7 @@
                 <w:noProof/>
                 <w:webHidden/>
               </w:rPr>
-              <w:instrText xml:space="preserve"> PAGEREF _Toc230270965 \h </w:instrText>
+              <w:instrText xml:space="preserve"> PAGEREF _Toc230338106 \h </w:instrText>
             </w:r>
             <w:r>
               <w:rPr>
@@ -1365,7 +1365,7 @@
               <w14:ligatures w14:val="standardContextual"/>
             </w:rPr>
           </w:pPr>
-          <w:hyperlink w:anchor="_Toc230270966" w:history="1">
+          <w:hyperlink w:anchor="_Toc230338107" w:history="1">
             <w:r>
               <w:rPr>
                 <w:rStyle w:val="Lienhypertexte"/>
@@ -1411,7 +1411,7 @@
                 <w:noProof/>
                 <w:webHidden/>
               </w:rPr>
-              <w:instrText xml:space="preserve"> PAGEREF _Toc230270966 \h </w:instrText>
+              <w:instrText xml:space="preserve"> PAGEREF _Toc230338107 \h </w:instrText>
             </w:r>
             <w:r>
               <w:rPr>
@@ -1459,7 +1459,7 @@
               <w14:ligatures w14:val="standardContextual"/>
             </w:rPr>
           </w:pPr>
-          <w:hyperlink w:anchor="_Toc230270967" w:history="1">
+          <w:hyperlink w:anchor="_Toc230338108" w:history="1">
             <w:r>
               <w:rPr>
                 <w:rStyle w:val="Lienhypertexte"/>
@@ -1505,7 +1505,7 @@
                 <w:noProof/>
                 <w:webHidden/>
               </w:rPr>
-              <w:instrText xml:space="preserve"> PAGEREF _Toc230270967 \h </w:instrText>
+              <w:instrText xml:space="preserve"> PAGEREF _Toc230338108 \h </w:instrText>
             </w:r>
             <w:r>
               <w:rPr>
@@ -1553,7 +1553,7 @@
               <w14:ligatures w14:val="standardContextual"/>
             </w:rPr>
           </w:pPr>
-          <w:hyperlink w:anchor="_Toc230270968" w:history="1">
+          <w:hyperlink w:anchor="_Toc230338109" w:history="1">
             <w:r>
               <w:rPr>
                 <w:rStyle w:val="Lienhypertexte"/>
@@ -1599,7 +1599,7 @@
                 <w:noProof/>
                 <w:webHidden/>
               </w:rPr>
-              <w:instrText xml:space="preserve"> PAGEREF _Toc230270968 \h </w:instrText>
+              <w:instrText xml:space="preserve"> PAGEREF _Toc230338109 \h </w:instrText>
             </w:r>
             <w:r>
               <w:rPr>
@@ -1647,7 +1647,7 @@
               <w14:ligatures w14:val="standardContextual"/>
             </w:rPr>
           </w:pPr>
-          <w:hyperlink w:anchor="_Toc230270969" w:history="1">
+          <w:hyperlink w:anchor="_Toc230338110" w:history="1">
             <w:r>
               <w:rPr>
                 <w:rStyle w:val="Lienhypertexte"/>
@@ -1693,7 +1693,7 @@
                 <w:noProof/>
                 <w:webHidden/>
               </w:rPr>
-              <w:instrText xml:space="preserve"> PAGEREF _Toc230270969 \h </w:instrText>
+              <w:instrText xml:space="preserve"> PAGEREF _Toc230338110 \h </w:instrText>
             </w:r>
             <w:r>
               <w:rPr>
@@ -1741,7 +1741,7 @@
               <w14:ligatures w14:val="standardContextual"/>
             </w:rPr>
           </w:pPr>
-          <w:hyperlink w:anchor="_Toc230270970" w:history="1">
+          <w:hyperlink w:anchor="_Toc230338111" w:history="1">
             <w:r>
               <w:rPr>
                 <w:rStyle w:val="Lienhypertexte"/>
@@ -1787,7 +1787,7 @@
                 <w:noProof/>
                 <w:webHidden/>
               </w:rPr>
-              <w:instrText xml:space="preserve"> PAGEREF _Toc230270970 \h </w:instrText>
+              <w:instrText xml:space="preserve"> PAGEREF _Toc230338111 \h </w:instrText>
             </w:r>
             <w:r>
               <w:rPr>
@@ -1835,7 +1835,7 @@
               <w14:ligatures w14:val="standardContextual"/>
             </w:rPr>
           </w:pPr>
-          <w:hyperlink w:anchor="_Toc230270971" w:history="1">
+          <w:hyperlink w:anchor="_Toc230338112" w:history="1">
             <w:r>
               <w:rPr>
                 <w:rStyle w:val="Lienhypertexte"/>
@@ -1881,7 +1881,7 @@
                 <w:noProof/>
                 <w:webHidden/>
               </w:rPr>
-              <w:instrText xml:space="preserve"> PAGEREF _Toc230270971 \h </w:instrText>
+              <w:instrText xml:space="preserve"> PAGEREF _Toc230338112 \h </w:instrText>
             </w:r>
             <w:r>
               <w:rPr>
@@ -1929,7 +1929,7 @@
               <w14:ligatures w14:val="standardContextual"/>
             </w:rPr>
           </w:pPr>
-          <w:hyperlink w:anchor="_Toc230270972" w:history="1">
+          <w:hyperlink w:anchor="_Toc230338113" w:history="1">
             <w:r>
               <w:rPr>
                 <w:rStyle w:val="Lienhypertexte"/>
@@ -1975,7 +1975,7 @@
                 <w:noProof/>
                 <w:webHidden/>
               </w:rPr>
-              <w:instrText xml:space="preserve"> PAGEREF _Toc230270972 \h </w:instrText>
+              <w:instrText xml:space="preserve"> PAGEREF _Toc230338113 \h </w:instrText>
             </w:r>
             <w:r>
               <w:rPr>
@@ -2023,7 +2023,7 @@
               <w14:ligatures w14:val="standardContextual"/>
             </w:rPr>
           </w:pPr>
-          <w:hyperlink w:anchor="_Toc230270973" w:history="1">
+          <w:hyperlink w:anchor="_Toc230338114" w:history="1">
             <w:r>
               <w:rPr>
                 <w:rStyle w:val="Lienhypertexte"/>
@@ -2069,7 +2069,7 @@
                 <w:noProof/>
                 <w:webHidden/>
               </w:rPr>
-              <w:instrText xml:space="preserve"> PAGEREF _Toc230270973 \h </w:instrText>
+              <w:instrText xml:space="preserve"> PAGEREF _Toc230338114 \h </w:instrText>
             </w:r>
             <w:r>
               <w:rPr>
@@ -2117,7 +2117,7 @@
               <w14:ligatures w14:val="standardContextual"/>
             </w:rPr>
           </w:pPr>
-          <w:hyperlink w:anchor="_Toc230270974" w:history="1">
+          <w:hyperlink w:anchor="_Toc230338115" w:history="1">
             <w:r>
               <w:rPr>
                 <w:rStyle w:val="Lienhypertexte"/>
@@ -2163,7 +2163,7 @@
                 <w:noProof/>
                 <w:webHidden/>
               </w:rPr>
-              <w:instrText xml:space="preserve"> PAGEREF _Toc230270974 \h </w:instrText>
+              <w:instrText xml:space="preserve"> PAGEREF _Toc230338115 \h </w:instrText>
             </w:r>
             <w:r>
               <w:rPr>
@@ -2211,7 +2211,7 @@
               <w14:ligatures w14:val="standardContextual"/>
             </w:rPr>
           </w:pPr>
-          <w:hyperlink w:anchor="_Toc230270975" w:history="1">
+          <w:hyperlink w:anchor="_Toc230338116" w:history="1">
             <w:r>
               <w:rPr>
                 <w:rStyle w:val="Lienhypertexte"/>
@@ -2257,7 +2257,7 @@
                 <w:noProof/>
                 <w:webHidden/>
               </w:rPr>
-              <w:instrText xml:space="preserve"> PAGEREF _Toc230270975 \h </w:instrText>
+              <w:instrText xml:space="preserve"> PAGEREF _Toc230338116 \h </w:instrText>
             </w:r>
             <w:r>
               <w:rPr>
@@ -2305,7 +2305,7 @@
               <w14:ligatures w14:val="standardContextual"/>
             </w:rPr>
           </w:pPr>
-          <w:hyperlink w:anchor="_Toc230270976" w:history="1">
+          <w:hyperlink w:anchor="_Toc230338117" w:history="1">
             <w:r>
               <w:rPr>
                 <w:rStyle w:val="Lienhypertexte"/>
@@ -2351,7 +2351,7 @@
                 <w:noProof/>
                 <w:webHidden/>
               </w:rPr>
-              <w:instrText xml:space="preserve"> PAGEREF _Toc230270976 \h </w:instrText>
+              <w:instrText xml:space="preserve"> PAGEREF _Toc230338117 \h </w:instrText>
             </w:r>
             <w:r>
               <w:rPr>
@@ -2371,7 +2371,7 @@
                 <w:noProof/>
                 <w:webHidden/>
               </w:rPr>
-              <w:t>6</w:t>
+              <w:t>7</w:t>
             </w:r>
             <w:r>
               <w:rPr>
@@ -2399,7 +2399,7 @@
               <w14:ligatures w14:val="standardContextual"/>
             </w:rPr>
           </w:pPr>
-          <w:hyperlink w:anchor="_Toc230270977" w:history="1">
+          <w:hyperlink w:anchor="_Toc230338118" w:history="1">
             <w:r>
               <w:rPr>
                 <w:rStyle w:val="Lienhypertexte"/>
@@ -2445,7 +2445,7 @@
                 <w:noProof/>
                 <w:webHidden/>
               </w:rPr>
-              <w:instrText xml:space="preserve"> PAGEREF _Toc230270977 \h </w:instrText>
+              <w:instrText xml:space="preserve"> PAGEREF _Toc230338118 \h </w:instrText>
             </w:r>
             <w:r>
               <w:rPr>
@@ -2465,7 +2465,7 @@
                 <w:noProof/>
                 <w:webHidden/>
               </w:rPr>
-              <w:t>7</w:t>
+              <w:t>8</w:t>
             </w:r>
             <w:r>
               <w:rPr>
@@ -2493,7 +2493,7 @@
               <w14:ligatures w14:val="standardContextual"/>
             </w:rPr>
           </w:pPr>
-          <w:hyperlink w:anchor="_Toc230270978" w:history="1">
+          <w:hyperlink w:anchor="_Toc230338119" w:history="1">
             <w:r>
               <w:rPr>
                 <w:rStyle w:val="Lienhypertexte"/>
@@ -2539,7 +2539,7 @@
                 <w:noProof/>
                 <w:webHidden/>
               </w:rPr>
-              <w:instrText xml:space="preserve"> PAGEREF _Toc230270978 \h </w:instrText>
+              <w:instrText xml:space="preserve"> PAGEREF _Toc230338119 \h </w:instrText>
             </w:r>
             <w:r>
               <w:rPr>
@@ -2559,7 +2559,7 @@
                 <w:noProof/>
                 <w:webHidden/>
               </w:rPr>
-              <w:t>7</w:t>
+              <w:t>8</w:t>
             </w:r>
             <w:r>
               <w:rPr>
@@ -2587,7 +2587,7 @@
               <w14:ligatures w14:val="standardContextual"/>
             </w:rPr>
           </w:pPr>
-          <w:hyperlink w:anchor="_Toc230270979" w:history="1">
+          <w:hyperlink w:anchor="_Toc230338120" w:history="1">
             <w:r>
               <w:rPr>
                 <w:rStyle w:val="Lienhypertexte"/>
@@ -2633,7 +2633,7 @@
                 <w:noProof/>
                 <w:webHidden/>
               </w:rPr>
-              <w:instrText xml:space="preserve"> PAGEREF _Toc230270979 \h </w:instrText>
+              <w:instrText xml:space="preserve"> PAGEREF _Toc230338120 \h </w:instrText>
             </w:r>
             <w:r>
               <w:rPr>
@@ -2653,7 +2653,7 @@
                 <w:noProof/>
                 <w:webHidden/>
               </w:rPr>
-              <w:t>8</w:t>
+              <w:t>9</w:t>
             </w:r>
             <w:r>
               <w:rPr>
@@ -2681,7 +2681,7 @@
               <w14:ligatures w14:val="standardContextual"/>
             </w:rPr>
           </w:pPr>
-          <w:hyperlink w:anchor="_Toc230270980" w:history="1">
+          <w:hyperlink w:anchor="_Toc230338121" w:history="1">
             <w:r>
               <w:rPr>
                 <w:rStyle w:val="Lienhypertexte"/>
@@ -2727,7 +2727,7 @@
                 <w:noProof/>
                 <w:webHidden/>
               </w:rPr>
-              <w:instrText xml:space="preserve"> PAGEREF _Toc230270980 \h </w:instrText>
+              <w:instrText xml:space="preserve"> PAGEREF _Toc230338121 \h </w:instrText>
             </w:r>
             <w:r>
               <w:rPr>
@@ -2747,7 +2747,7 @@
                 <w:noProof/>
                 <w:webHidden/>
               </w:rPr>
-              <w:t>8</w:t>
+              <w:t>9</w:t>
             </w:r>
             <w:r>
               <w:rPr>
@@ -2775,7 +2775,7 @@
               <w14:ligatures w14:val="standardContextual"/>
             </w:rPr>
           </w:pPr>
-          <w:hyperlink w:anchor="_Toc230270981" w:history="1">
+          <w:hyperlink w:anchor="_Toc230338122" w:history="1">
             <w:r>
               <w:rPr>
                 <w:rStyle w:val="Lienhypertexte"/>
@@ -2821,7 +2821,7 @@
                 <w:noProof/>
                 <w:webHidden/>
               </w:rPr>
-              <w:instrText xml:space="preserve"> PAGEREF _Toc230270981 \h </w:instrText>
+              <w:instrText xml:space="preserve"> PAGEREF _Toc230338122 \h </w:instrText>
             </w:r>
             <w:r>
               <w:rPr>
@@ -2841,7 +2841,7 @@
                 <w:noProof/>
                 <w:webHidden/>
               </w:rPr>
-              <w:t>9</w:t>
+              <w:t>10</w:t>
             </w:r>
             <w:r>
               <w:rPr>
@@ -2869,7 +2869,7 @@
               <w14:ligatures w14:val="standardContextual"/>
             </w:rPr>
           </w:pPr>
-          <w:hyperlink w:anchor="_Toc230270982" w:history="1">
+          <w:hyperlink w:anchor="_Toc230338123" w:history="1">
             <w:r>
               <w:rPr>
                 <w:rStyle w:val="Lienhypertexte"/>
@@ -2915,7 +2915,7 @@
                 <w:noProof/>
                 <w:webHidden/>
               </w:rPr>
-              <w:instrText xml:space="preserve"> PAGEREF _Toc230270982 \h </w:instrText>
+              <w:instrText xml:space="preserve"> PAGEREF _Toc230338123 \h </w:instrText>
             </w:r>
             <w:r>
               <w:rPr>
@@ -2935,7 +2935,7 @@
                 <w:noProof/>
                 <w:webHidden/>
               </w:rPr>
-              <w:t>9</w:t>
+              <w:t>10</w:t>
             </w:r>
             <w:r>
               <w:rPr>
@@ -2963,7 +2963,7 @@
               <w14:ligatures w14:val="standardContextual"/>
             </w:rPr>
           </w:pPr>
-          <w:hyperlink w:anchor="_Toc230270983" w:history="1">
+          <w:hyperlink w:anchor="_Toc230338124" w:history="1">
             <w:r>
               <w:rPr>
                 <w:rStyle w:val="Lienhypertexte"/>
@@ -3009,7 +3009,7 @@
                 <w:noProof/>
                 <w:webHidden/>
               </w:rPr>
-              <w:instrText xml:space="preserve"> PAGEREF _Toc230270983 \h </w:instrText>
+              <w:instrText xml:space="preserve"> PAGEREF _Toc230338124 \h </w:instrText>
             </w:r>
             <w:r>
               <w:rPr>
@@ -3029,7 +3029,7 @@
                 <w:noProof/>
                 <w:webHidden/>
               </w:rPr>
-              <w:t>9</w:t>
+              <w:t>10</w:t>
             </w:r>
             <w:r>
               <w:rPr>
@@ -3057,7 +3057,7 @@
               <w14:ligatures w14:val="standardContextual"/>
             </w:rPr>
           </w:pPr>
-          <w:hyperlink w:anchor="_Toc230270984" w:history="1">
+          <w:hyperlink w:anchor="_Toc230338125" w:history="1">
             <w:r>
               <w:rPr>
                 <w:rStyle w:val="Lienhypertexte"/>
@@ -3103,7 +3103,7 @@
                 <w:noProof/>
                 <w:webHidden/>
               </w:rPr>
-              <w:instrText xml:space="preserve"> PAGEREF _Toc230270984 \h </w:instrText>
+              <w:instrText xml:space="preserve"> PAGEREF _Toc230338125 \h </w:instrText>
             </w:r>
             <w:r>
               <w:rPr>
@@ -3123,7 +3123,7 @@
                 <w:noProof/>
                 <w:webHidden/>
               </w:rPr>
-              <w:t>10</w:t>
+              <w:t>11</w:t>
             </w:r>
             <w:r>
               <w:rPr>
@@ -3151,7 +3151,7 @@
               <w14:ligatures w14:val="standardContextual"/>
             </w:rPr>
           </w:pPr>
-          <w:hyperlink w:anchor="_Toc230270985" w:history="1">
+          <w:hyperlink w:anchor="_Toc230338126" w:history="1">
             <w:r>
               <w:rPr>
                 <w:rStyle w:val="Lienhypertexte"/>
@@ -3197,7 +3197,7 @@
                 <w:noProof/>
                 <w:webHidden/>
               </w:rPr>
-              <w:instrText xml:space="preserve"> PAGEREF _Toc230270985 \h </w:instrText>
+              <w:instrText xml:space="preserve"> PAGEREF _Toc230338126 \h </w:instrText>
             </w:r>
             <w:r>
               <w:rPr>
@@ -3217,7 +3217,7 @@
                 <w:noProof/>
                 <w:webHidden/>
               </w:rPr>
-              <w:t>10</w:t>
+              <w:t>11</w:t>
             </w:r>
             <w:r>
               <w:rPr>
@@ -3245,7 +3245,7 @@
               <w14:ligatures w14:val="standardContextual"/>
             </w:rPr>
           </w:pPr>
-          <w:hyperlink w:anchor="_Toc230270986" w:history="1">
+          <w:hyperlink w:anchor="_Toc230338127" w:history="1">
             <w:r>
               <w:rPr>
                 <w:rStyle w:val="Lienhypertexte"/>
@@ -3291,7 +3291,7 @@
                 <w:noProof/>
                 <w:webHidden/>
               </w:rPr>
-              <w:instrText xml:space="preserve"> PAGEREF _Toc230270986 \h </w:instrText>
+              <w:instrText xml:space="preserve"> PAGEREF _Toc230338127 \h </w:instrText>
             </w:r>
             <w:r>
               <w:rPr>
@@ -3311,7 +3311,7 @@
                 <w:noProof/>
                 <w:webHidden/>
               </w:rPr>
-              <w:t>11</w:t>
+              <w:t>12</w:t>
             </w:r>
             <w:r>
               <w:rPr>
@@ -3339,7 +3339,7 @@
               <w14:ligatures w14:val="standardContextual"/>
             </w:rPr>
           </w:pPr>
-          <w:hyperlink w:anchor="_Toc230270987" w:history="1">
+          <w:hyperlink w:anchor="_Toc230338128" w:history="1">
             <w:r>
               <w:rPr>
                 <w:rStyle w:val="Lienhypertexte"/>
@@ -3385,7 +3385,7 @@
                 <w:noProof/>
                 <w:webHidden/>
               </w:rPr>
-              <w:instrText xml:space="preserve"> PAGEREF _Toc230270987 \h </w:instrText>
+              <w:instrText xml:space="preserve"> PAGEREF _Toc230338128 \h </w:instrText>
             </w:r>
             <w:r>
               <w:rPr>
@@ -3405,7 +3405,7 @@
                 <w:noProof/>
                 <w:webHidden/>
               </w:rPr>
-              <w:t>11</w:t>
+              <w:t>12</w:t>
             </w:r>
             <w:r>
               <w:rPr>
@@ -3452,7 +3452,7 @@
         <w:spacing w:after="240"/>
         <w:jc w:val="both"/>
       </w:pPr>
-      <w:bookmarkStart w:id="0" w:name="_Toc230270965"/>
+      <w:bookmarkStart w:id="0" w:name="_Toc230338106"/>
       <w:r>
         <w:lastRenderedPageBreak/>
         <w:t>Remerciement</w:t>
@@ -3516,7 +3516,7 @@
         <w:spacing w:after="240"/>
         <w:jc w:val="both"/>
       </w:pPr>
-      <w:bookmarkStart w:id="1" w:name="_Toc230270966"/>
+      <w:bookmarkStart w:id="1" w:name="_Toc230338107"/>
       <w:r>
         <w:t>Introduction</w:t>
       </w:r>
@@ -3646,7 +3646,7 @@
         <w:spacing w:after="240"/>
         <w:jc w:val="both"/>
       </w:pPr>
-      <w:bookmarkStart w:id="2" w:name="_Toc230270967"/>
+      <w:bookmarkStart w:id="2" w:name="_Toc230338108"/>
       <w:r>
         <w:lastRenderedPageBreak/>
         <w:t>Objectif du Projet</w:t>
@@ -3659,7 +3659,7 @@
         <w:spacing w:after="240"/>
         <w:jc w:val="both"/>
       </w:pPr>
-      <w:bookmarkStart w:id="3" w:name="_Toc230270968"/>
+      <w:bookmarkStart w:id="3" w:name="_Toc230338109"/>
       <w:r>
         <w:t>Contexte et Problématique</w:t>
       </w:r>
@@ -3812,7 +3812,7 @@
         <w:spacing w:after="240"/>
         <w:jc w:val="both"/>
       </w:pPr>
-      <w:bookmarkStart w:id="4" w:name="_Toc230270969"/>
+      <w:bookmarkStart w:id="4" w:name="_Toc230338110"/>
       <w:r>
         <w:t>Les Différents choix d’Implémentations</w:t>
       </w:r>
@@ -3842,7 +3842,7 @@
         <w:spacing w:after="240"/>
         <w:jc w:val="both"/>
       </w:pPr>
-      <w:bookmarkStart w:id="5" w:name="_Toc230270970"/>
+      <w:bookmarkStart w:id="5" w:name="_Toc230338111"/>
       <w:r>
         <w:t>Utilisation d’un Autocollant Physique</w:t>
       </w:r>
@@ -3996,7 +3996,7 @@
         <w:spacing w:after="240"/>
         <w:jc w:val="both"/>
       </w:pPr>
-      <w:bookmarkStart w:id="6" w:name="_Toc230270971"/>
+      <w:bookmarkStart w:id="6" w:name="_Toc230338112"/>
       <w:r>
         <w:t>Le choix d’</w:t>
       </w:r>
@@ -4047,7 +4047,7 @@
         <w:spacing w:after="240"/>
         <w:jc w:val="both"/>
       </w:pPr>
-      <w:bookmarkStart w:id="7" w:name="_Toc230270972"/>
+      <w:bookmarkStart w:id="7" w:name="_Toc230338113"/>
       <w:r>
         <w:t xml:space="preserve">Le Choix de </w:t>
       </w:r>
@@ -4093,7 +4093,7 @@
         <w:spacing w:after="240"/>
         <w:jc w:val="both"/>
       </w:pPr>
-      <w:bookmarkStart w:id="8" w:name="_Toc230270973"/>
+      <w:bookmarkStart w:id="8" w:name="_Toc230338114"/>
       <w:r>
         <w:t>Implémentation</w:t>
       </w:r>
@@ -4157,7 +4157,7 @@
         <w:spacing w:after="240"/>
         <w:jc w:val="both"/>
       </w:pPr>
-      <w:bookmarkStart w:id="9" w:name="_Toc230270974"/>
+      <w:bookmarkStart w:id="9" w:name="_Toc230338115"/>
       <w:r>
         <w:t>Implémentation</w:t>
       </w:r>
@@ -4196,7 +4196,7 @@
         <w:spacing w:after="240"/>
         <w:jc w:val="both"/>
       </w:pPr>
-      <w:bookmarkStart w:id="10" w:name="_Toc230270975"/>
+      <w:bookmarkStart w:id="10" w:name="_Toc230338116"/>
       <w:r>
         <w:t>IA pour la Détection de l’Autocollant</w:t>
       </w:r>
@@ -4248,10 +4248,169 @@
         <w:t xml:space="preserve">. </w:t>
       </w:r>
       <w:r>
-        <w:t xml:space="preserve">A noter qu’avec cette méthode on retourne les valeurs de la boite englobante qui a détecter l’autocollant et les 4 coins précis qui délimitent l’autocollant, c’est pour pouvoir détecter les photos un peu pencher même si toute les photos restent prisent de face. </w:t>
-      </w:r>
-      <w:r>
-        <w:t>Ce travail préparatoire a considérablement renforcé la robustesse du modèle final avant son exportation vers TensorFlow Lite.</w:t>
+        <w:t xml:space="preserve">A noter qu’avec cette méthode on retourne les valeurs de la boite englobante qui a détecter l’autocollant et les 4 coins précis qui délimitent l’autocollant, c’est pour pouvoir détecter </w:t>
+      </w:r>
+      <w:r>
+        <w:rPr>
+          <w:noProof/>
+        </w:rPr>
+        <mc:AlternateContent>
+          <mc:Choice Requires="wps">
+            <w:drawing>
+              <wp:anchor distT="45720" distB="45720" distL="114300" distR="114300" simplePos="0" relativeHeight="251673600" behindDoc="0" locked="0" layoutInCell="1" allowOverlap="1" wp14:anchorId="43ED134F" wp14:editId="12ADBA43">
+                <wp:simplePos x="0" y="0"/>
+                <wp:positionH relativeFrom="margin">
+                  <wp:posOffset>-635</wp:posOffset>
+                </wp:positionH>
+                <wp:positionV relativeFrom="paragraph">
+                  <wp:posOffset>4205605</wp:posOffset>
+                </wp:positionV>
+                <wp:extent cx="5745480" cy="335280"/>
+                <wp:effectExtent l="0" t="0" r="26670" b="26670"/>
+                <wp:wrapSquare wrapText="bothSides"/>
+                <wp:docPr id="354764840" name="Zone de texte 2"/>
+                <wp:cNvGraphicFramePr>
+                  <a:graphicFrameLocks xmlns:a="http://schemas.openxmlformats.org/drawingml/2006/main"/>
+                </wp:cNvGraphicFramePr>
+                <a:graphic xmlns:a="http://schemas.openxmlformats.org/drawingml/2006/main">
+                  <a:graphicData uri="http://schemas.microsoft.com/office/word/2010/wordprocessingShape">
+                    <wps:wsp>
+                      <wps:cNvSpPr txBox="1">
+                        <a:spLocks noChangeArrowheads="1"/>
+                      </wps:cNvSpPr>
+                      <wps:spPr bwMode="auto">
+                        <a:xfrm>
+                          <a:off x="0" y="0"/>
+                          <a:ext cx="5745480" cy="335280"/>
+                        </a:xfrm>
+                        <a:prstGeom prst="rect">
+                          <a:avLst/>
+                        </a:prstGeom>
+                        <a:solidFill>
+                          <a:srgbClr val="FFFFFF"/>
+                        </a:solidFill>
+                        <a:ln w="9525">
+                          <a:solidFill>
+                            <a:srgbClr val="000000"/>
+                          </a:solidFill>
+                          <a:miter lim="800000"/>
+                          <a:headEnd/>
+                          <a:tailEnd/>
+                        </a:ln>
+                      </wps:spPr>
+                      <wps:txbx>
+                        <w:txbxContent>
+                          <w:p>
+                            <w:pPr>
+                              <w:jc w:val="center"/>
+                              <w:rPr>
+                                <w:color w:val="4472C4" w:themeColor="accent1"/>
+                              </w:rPr>
+                            </w:pPr>
+                            <w:r>
+                              <w:rPr>
+                                <w:color w:val="4472C4" w:themeColor="accent1"/>
+                              </w:rPr>
+                              <w:t>Interface de Roboflow pour annoter les images du dataset</w:t>
+                            </w:r>
+                          </w:p>
+                        </w:txbxContent>
+                      </wps:txbx>
+                      <wps:bodyPr rot="0" vert="horz" wrap="square" lIns="91440" tIns="45720" rIns="91440" bIns="45720" anchor="t" anchorCtr="0">
+                        <a:noAutofit/>
+                      </wps:bodyPr>
+                    </wps:wsp>
+                  </a:graphicData>
+                </a:graphic>
+                <wp14:sizeRelH relativeFrom="margin">
+                  <wp14:pctWidth>0</wp14:pctWidth>
+                </wp14:sizeRelH>
+                <wp14:sizeRelV relativeFrom="margin">
+                  <wp14:pctHeight>0</wp14:pctHeight>
+                </wp14:sizeRelV>
+              </wp:anchor>
+            </w:drawing>
+          </mc:Choice>
+          <mc:Fallback>
+            <w:pict>
+              <v:shape w14:anchorId="43ED134F" id="Zone de texte 2" o:spid="_x0000_s1028" type="#_x0000_t202" style="position:absolute;left:0;text-align:left;margin-left:-.05pt;margin-top:331.15pt;width:452.4pt;height:26.4pt;z-index:251673600;visibility:visible;mso-wrap-style:square;mso-width-percent:0;mso-height-percent:0;mso-wrap-distance-left:9pt;mso-wrap-distance-top:3.6pt;mso-wrap-distance-right:9pt;mso-wrap-distance-bottom:3.6pt;mso-position-horizontal:absolute;mso-position-horizontal-relative:margin;mso-position-vertical:absolute;mso-position-vertical-relative:text;mso-width-percent:0;mso-height-percent:0;mso-width-relative:margin;mso-height-relative:margin;v-text-anchor:top" o:gfxdata="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">
+                <v:textbox>
+                  <w:txbxContent>
+                    <w:p>
+                      <w:pPr>
+                        <w:jc w:val="center"/>
+                        <w:rPr>
+                          <w:color w:val="4472C4" w:themeColor="accent1"/>
+                        </w:rPr>
+                      </w:pPr>
+                      <w:r>
+                        <w:rPr>
+                          <w:color w:val="4472C4" w:themeColor="accent1"/>
+                        </w:rPr>
+                        <w:t>Interface de Roboflow pour annoter les images du dataset</w:t>
+                      </w:r>
+                    </w:p>
+                  </w:txbxContent>
+                </v:textbox>
+                <w10:wrap type="square" anchorx="margin"/>
+              </v:shape>
+            </w:pict>
+          </mc:Fallback>
+        </mc:AlternateContent>
+      </w:r>
+      <w:r>
+        <w:drawing>
+          <wp:anchor distT="0" distB="0" distL="114300" distR="114300" simplePos="0" relativeHeight="251671552" behindDoc="0" locked="0" layoutInCell="1" allowOverlap="1" wp14:anchorId="3A277ABE" wp14:editId="6AFE9AEA">
+            <wp:simplePos x="0" y="0"/>
+            <wp:positionH relativeFrom="margin">
+              <wp:align>right</wp:align>
+            </wp:positionH>
+            <wp:positionV relativeFrom="paragraph">
+              <wp:posOffset>1553845</wp:posOffset>
+            </wp:positionV>
+            <wp:extent cx="5760720" cy="2531745"/>
+            <wp:effectExtent l="0" t="0" r="0" b="1905"/>
+            <wp:wrapTopAndBottom/>
+            <wp:docPr id="490655979" name="Image 1"/>
+            <wp:cNvGraphicFramePr>
+              <a:graphicFrameLocks xmlns:a="http://schemas.openxmlformats.org/drawingml/2006/main" noChangeAspect="1"/>
+            </wp:cNvGraphicFramePr>
+            <a:graphic xmlns:a="http://schemas.openxmlformats.org/drawingml/2006/main">
+              <a:graphicData uri="http://schemas.openxmlformats.org/drawingml/2006/picture">
+                <pic:pic xmlns:pic="http://schemas.openxmlformats.org/drawingml/2006/picture">
+                  <pic:nvPicPr>
+                    <pic:cNvPr id="490655979" name=""/>
+                    <pic:cNvPicPr/>
+                  </pic:nvPicPr>
+                  <pic:blipFill>
+                    <a:blip r:embed="rId9" cstate="print">
+                      <a:extLst>
+                        <a:ext uri="{28A0092B-C50C-407E-A947-70E740481C1C}">
+                          <a14:useLocalDpi xmlns:a14="http://schemas.microsoft.com/office/drawing/2010/main" val="0"/>
+                        </a:ext>
+                      </a:extLst>
+                    </a:blip>
+                    <a:stretch>
+                      <a:fillRect/>
+                    </a:stretch>
+                  </pic:blipFill>
+                  <pic:spPr>
+                    <a:xfrm>
+                      <a:off x="0" y="0"/>
+                      <a:ext cx="5760720" cy="2531745"/>
+                    </a:xfrm>
+                    <a:prstGeom prst="rect">
+                      <a:avLst/>
+                    </a:prstGeom>
+                  </pic:spPr>
+                </pic:pic>
+              </a:graphicData>
+            </a:graphic>
+          </wp:anchor>
+        </w:drawing>
+      </w:r>
+      <w:r>
+        <w:t xml:space="preserve">les photos un peu pencher même si toute les photos restent prisent de face. </w:t>
       </w:r>
     </w:p>
     <w:p>
@@ -4260,25 +4419,7 @@
         <w:jc w:val="both"/>
       </w:pPr>
       <w:r>
-        <w:t xml:space="preserve">Il est important de souligner que toute cette phase de conception, d'entraînement et d'évaluation du modèle d'Intelligence Artificielle a été intégralement codée et exécutée en Python. Ce langage étant </w:t>
-      </w:r>
-      <w:r>
-        <w:t xml:space="preserve">un peu considérer comme </w:t>
-      </w:r>
-      <w:r>
-        <w:t xml:space="preserve">le standard incontesté en science des données, il nous a permis d'exploiter efficacement les bibliothèques d'apprentissage automatique de l'écosystème YOLO. Ce n'est qu'une fois le réseau de neurones testé et validé sous Python qu'il a été exporté et converti au format TensorFlow Lite (.tflite), </w:t>
-      </w:r>
-      <w:r>
-        <w:t xml:space="preserve">un des </w:t>
-      </w:r>
-      <w:r>
-        <w:t>seul</w:t>
-      </w:r>
-      <w:r>
-        <w:t>s</w:t>
-      </w:r>
-      <w:r>
-        <w:t xml:space="preserve"> format optimisé pour une exécution embarquée et hors-ligne au sein de notre application Flutter.</w:t>
+        <w:t>Ce travail préparatoire a considérablement renforcé la robustesse du modèle final avant son exportation vers TensorFlow Lite.</w:t>
       </w:r>
     </w:p>
     <w:p>
@@ -4287,7 +4428,25 @@
         <w:jc w:val="both"/>
       </w:pPr>
       <w:r>
-        <w:t>Une fois le modèle entraîné, la principale difficulté technique rencontrée côté code a résidé dans la préparation et la manipulation des données brutes de l'appareil photo du smartphone. Les photographies capturées étant d'une résolution très élevée, il a fallu concevoir un algorithme de prétraitement robuste pour redimensionner l'image au format strict requis par YOLO (une matrice de 1024x1024 pixels) et normaliser les valeurs colorimétriques. De plus, pour s'assurer que notre application puisse s'adapter aux différentes architectures matérielles des téléphones (iOS, Android), il a fallu coder une logique capable de gérer dynamiquement l'ordre des canaux de la matrice (formats NHWC ou NCHW).</w:t>
+        <w:t xml:space="preserve">Il est important de souligner que toute cette phase de conception, d'entraînement et d'évaluation du modèle d'Intelligence Artificielle a été intégralement codée et exécutée en Python. Ce langage étant </w:t>
+      </w:r>
+      <w:r>
+        <w:t xml:space="preserve">un peu considérer comme </w:t>
+      </w:r>
+      <w:r>
+        <w:t xml:space="preserve">le standard incontesté en science des données, il nous a permis d'exploiter efficacement les bibliothèques d'apprentissage automatique de l'écosystème YOLO. Ce n'est qu'une fois le réseau de neurones testé et validé sous Python qu'il a été exporté et converti au format TensorFlow Lite (.tflite), </w:t>
+      </w:r>
+      <w:r>
+        <w:t xml:space="preserve">un des </w:t>
+      </w:r>
+      <w:r>
+        <w:t>seul</w:t>
+      </w:r>
+      <w:r>
+        <w:t>s</w:t>
+      </w:r>
+      <w:r>
+        <w:t xml:space="preserve"> format optimisé pour une exécution embarquée et hors-ligne au sein de notre application Flutter.</w:t>
       </w:r>
     </w:p>
     <w:p>
@@ -4296,7 +4455,20 @@
         <w:jc w:val="both"/>
       </w:pPr>
       <w:r>
-        <w:t>Le post-traitement des résultats a également présenté son lot de défis. Il a fallu trier rigoureusement les quatre points de détection fournis par l'IA à l'aide de formules mathématiques pour garantir que l'ordre (haut-gauche, haut-droit, bas-droit, bas-gauche) soit toujours exact. Sans ce tri géométrique, les calculs de perspective ultérieurs auraient généré des équipements inversés ou tordus (</w:t>
+        <w:t>Une fois le modèle entraîné, la principale difficulté technique rencontrée côté code a résidé dans la préparation et la manipulation des données brutes de l'appareil photo du smartphone. Les photographies capturées étant d'une résolution très élevée, il a fallu concevoir un algorithme de prétraitement robuste pour redimensionner l'image au format strict requis par YOLO (une matrice de 1024x1024 pixels) et normaliser les valeurs colorimétriques. De plus, pour s'assurer que notre application puisse s'adapter aux différentes architectures matérielles des téléphones (iOS, Android), il a fallu coder une logique capable de gérer dynamiquement l'ordre des canaux de la matrice (formats NHWC ou NCHW).</w:t>
+      </w:r>
+    </w:p>
+    <w:p>
+      <w:pPr>
+        <w:ind w:firstLine="708"/>
+        <w:jc w:val="both"/>
+      </w:pPr>
+      <w:r>
+        <w:t xml:space="preserve">Le post-traitement des résultats a également présenté son lot de défis. Il a fallu trier rigoureusement les quatre points de détection fournis par l'IA à l'aide de formules mathématiques pour garantir que l'ordre (haut-gauche, haut-droit, bas-droit, bas-gauche) soit toujours exact. Sans ce tri géométrique, les calculs de perspective ultérieurs auraient généré des équipements inversés ou </w:t>
+      </w:r>
+      <w:r>
+        <w:lastRenderedPageBreak/>
+        <w:t>tordus (</w:t>
       </w:r>
       <w:r>
         <w:t>A</w:t>
@@ -4329,7 +4501,7 @@
         <w:spacing w:after="240"/>
         <w:jc w:val="both"/>
       </w:pPr>
-      <w:bookmarkStart w:id="11" w:name="_Toc230270976"/>
+      <w:bookmarkStart w:id="11" w:name="_Toc230338117"/>
       <w:r>
         <w:t>Inpainting pour Effacer l’Autocollant du Mur</w:t>
       </w:r>
@@ -4382,11 +4554,7 @@
         <w:t xml:space="preserve"> </w:t>
       </w:r>
       <w:r>
-        <w:t xml:space="preserve">Faire tourner un réseau de neurones génératif sur un appareil mobile est un défi technique en termes de consommation de mémoire et de puissance de calcul. La solution d'optimisation que nous avons </w:t>
-      </w:r>
-      <w:r>
-        <w:lastRenderedPageBreak/>
-        <w:t>implémentée a été d'isoler uniquement la zone de travail. Au lieu de demander à l'IA de traiter l'image entière, le code calcule une zone de recadrage (représentant 2,5 fois la taille de l'autocollant pour donner du contexte spatial au modèle), redimensionne ce petit patch au format requis de 512x512 pixels, puis exécute l'inférence.</w:t>
+        <w:t>Faire tourner un réseau de neurones génératif sur un appareil mobile est un défi technique en termes de consommation de mémoire et de puissance de calcul. La solution d'optimisation que nous avons implémentée a été d'isoler uniquement la zone de travail. Au lieu de demander à l'IA de traiter l'image entière, le code calcule une zone de recadrage (représentant 2,5 fois la taille de l'autocollant pour donner du contexte spatial au modèle), redimensionne ce petit patch au format requis de 512x512 pixels, puis exécute l'inférence.</w:t>
       </w:r>
     </w:p>
     <w:p>
@@ -4396,6 +4564,255 @@
       </w:pPr>
       <w:r>
         <w:t>Cependant, la restitution de ce patch généré par l'IA a mis en évidence de sérieux problèmes de réalisme visuel. Le modèle génératif avait tendance à produire des réparations trop « lisses », présentant de légères bavures chromatiques ou un rendu géométrique incohérent, créant une démarcation artificielle flagrante avec le grain photographique naturel du reste du mur. Pour corriger cela de manière procédurale et sans intervention humaine, nous avons développé une série de post-traitements spécifiques. Avant l'inpainting, le masque de l'autocollant est informatiquement rempli avec la couleur moyenne environnante pour guider et faciliter le travail de l'IA. Après l'inpainting, le patch reconstruit subit un redimensionnement de haute qualité par interpolation Lanczos4, puis un filtre de netteté est appliqué pour récupérer les détails de la texture du mur. Enfin, nous injectons un bruit gaussien artificiel calculé pour reproduire fidèlement le grain du capteur de l'appareil photo. Ce n'est qu'après ce traitement rigoureux que le patch est fondu dans la photographie d'origine par une fusion adoucie des bords, rendant la disparition de l'autocollant totalement indiscernable à l'œil nu.</w:t>
+      </w:r>
+      <w:r>
+        <w:t xml:space="preserve"> </w:t>
+      </w:r>
+      <w:r>
+        <w:lastRenderedPageBreak/>
+        <w:t xml:space="preserve">Mais même avec tout ça, ça n’est pas suffisant car y’a des images où ça marche excellemment bien </w:t>
+      </w:r>
+      <w:r>
+        <w:rPr>
+          <w:noProof/>
+        </w:rPr>
+        <mc:AlternateContent>
+          <mc:Choice Requires="wps">
+            <w:drawing>
+              <wp:anchor distT="45720" distB="45720" distL="114300" distR="114300" simplePos="0" relativeHeight="251677696" behindDoc="0" locked="0" layoutInCell="1" allowOverlap="1" wp14:anchorId="7949ACDC" wp14:editId="1763AE53">
+                <wp:simplePos x="0" y="0"/>
+                <wp:positionH relativeFrom="margin">
+                  <wp:align>left</wp:align>
+                </wp:positionH>
+                <wp:positionV relativeFrom="paragraph">
+                  <wp:posOffset>3302635</wp:posOffset>
+                </wp:positionV>
+                <wp:extent cx="5745480" cy="289560"/>
+                <wp:effectExtent l="0" t="0" r="26670" b="15240"/>
+                <wp:wrapSquare wrapText="bothSides"/>
+                <wp:docPr id="510313683" name="Zone de texte 2"/>
+                <wp:cNvGraphicFramePr>
+                  <a:graphicFrameLocks xmlns:a="http://schemas.openxmlformats.org/drawingml/2006/main"/>
+                </wp:cNvGraphicFramePr>
+                <a:graphic xmlns:a="http://schemas.openxmlformats.org/drawingml/2006/main">
+                  <a:graphicData uri="http://schemas.microsoft.com/office/word/2010/wordprocessingShape">
+                    <wps:wsp>
+                      <wps:cNvSpPr txBox="1">
+                        <a:spLocks noChangeArrowheads="1"/>
+                      </wps:cNvSpPr>
+                      <wps:spPr bwMode="auto">
+                        <a:xfrm>
+                          <a:off x="0" y="0"/>
+                          <a:ext cx="5745480" cy="289560"/>
+                        </a:xfrm>
+                        <a:prstGeom prst="rect">
+                          <a:avLst/>
+                        </a:prstGeom>
+                        <a:solidFill>
+                          <a:srgbClr val="FFFFFF"/>
+                        </a:solidFill>
+                        <a:ln w="9525">
+                          <a:solidFill>
+                            <a:srgbClr val="000000"/>
+                          </a:solidFill>
+                          <a:miter lim="800000"/>
+                          <a:headEnd/>
+                          <a:tailEnd/>
+                        </a:ln>
+                      </wps:spPr>
+                      <wps:txbx>
+                        <w:txbxContent>
+                          <w:p>
+                            <w:pPr>
+                              <w:jc w:val="center"/>
+                              <w:rPr>
+                                <w:color w:val="4472C4" w:themeColor="accent1"/>
+                              </w:rPr>
+                            </w:pPr>
+                            <w:r>
+                              <w:rPr>
+                                <w:color w:val="4472C4" w:themeColor="accent1"/>
+                              </w:rPr>
+                              <w:t>Avant/Après de l’Inpainting</w:t>
+                            </w:r>
+                          </w:p>
+                        </w:txbxContent>
+                      </wps:txbx>
+                      <wps:bodyPr rot="0" vert="horz" wrap="square" lIns="91440" tIns="45720" rIns="91440" bIns="45720" anchor="t" anchorCtr="0">
+                        <a:noAutofit/>
+                      </wps:bodyPr>
+                    </wps:wsp>
+                  </a:graphicData>
+                </a:graphic>
+                <wp14:sizeRelH relativeFrom="margin">
+                  <wp14:pctWidth>0</wp14:pctWidth>
+                </wp14:sizeRelH>
+                <wp14:sizeRelV relativeFrom="margin">
+                  <wp14:pctHeight>0</wp14:pctHeight>
+                </wp14:sizeRelV>
+              </wp:anchor>
+            </w:drawing>
+          </mc:Choice>
+          <mc:Fallback>
+            <w:pict>
+              <v:shape w14:anchorId="7949ACDC" id="_x0000_s1029" type="#_x0000_t202" style="position:absolute;left:0;text-align:left;margin-left:0;margin-top:260.05pt;width:452.4pt;height:22.8pt;z-index:251677696;visibility:visible;mso-wrap-style:square;mso-width-percent:0;mso-height-percent:0;mso-wrap-distance-left:9pt;mso-wrap-distance-top:3.6pt;mso-wrap-distance-right:9pt;mso-wrap-distance-bottom:3.6pt;mso-position-horizontal:left;mso-position-horizontal-relative:margin;mso-position-vertical:absolute;mso-position-vertical-relative:text;mso-width-percent:0;mso-height-percent:0;mso-width-relative:margin;mso-height-relative:margin;v-text-anchor:top" o:gfxdata="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">
+                <v:textbox>
+                  <w:txbxContent>
+                    <w:p>
+                      <w:pPr>
+                        <w:jc w:val="center"/>
+                        <w:rPr>
+                          <w:color w:val="4472C4" w:themeColor="accent1"/>
+                        </w:rPr>
+                      </w:pPr>
+                      <w:r>
+                        <w:rPr>
+                          <w:color w:val="4472C4" w:themeColor="accent1"/>
+                        </w:rPr>
+                        <w:t>Avant/Après de l’Inpainting</w:t>
+                      </w:r>
+                    </w:p>
+                  </w:txbxContent>
+                </v:textbox>
+                <w10:wrap type="square" anchorx="margin"/>
+              </v:shape>
+            </w:pict>
+          </mc:Fallback>
+        </mc:AlternateContent>
+      </w:r>
+      <w:r>
+        <w:drawing>
+          <wp:anchor distT="0" distB="0" distL="114300" distR="114300" simplePos="0" relativeHeight="251675648" behindDoc="0" locked="0" layoutInCell="1" allowOverlap="1" wp14:anchorId="44934B2D" wp14:editId="6573DB1B">
+            <wp:simplePos x="0" y="0"/>
+            <wp:positionH relativeFrom="margin">
+              <wp:align>right</wp:align>
+            </wp:positionH>
+            <wp:positionV relativeFrom="paragraph">
+              <wp:posOffset>433705</wp:posOffset>
+            </wp:positionV>
+            <wp:extent cx="2764790" cy="2781300"/>
+            <wp:effectExtent l="0" t="0" r="0" b="0"/>
+            <wp:wrapTopAndBottom/>
+            <wp:docPr id="287104934" name="Image 12"/>
+            <wp:cNvGraphicFramePr>
+              <a:graphicFrameLocks xmlns:a="http://schemas.openxmlformats.org/drawingml/2006/main" noChangeAspect="1"/>
+            </wp:cNvGraphicFramePr>
+            <a:graphic xmlns:a="http://schemas.openxmlformats.org/drawingml/2006/main">
+              <a:graphicData uri="http://schemas.openxmlformats.org/drawingml/2006/picture">
+                <pic:pic xmlns:pic="http://schemas.openxmlformats.org/drawingml/2006/picture">
+                  <pic:nvPicPr>
+                    <pic:cNvPr id="0" name="Picture 8"/>
+                    <pic:cNvPicPr>
+                      <a:picLocks noChangeAspect="1" noChangeArrowheads="1"/>
+                    </pic:cNvPicPr>
+                  </pic:nvPicPr>
+                  <pic:blipFill>
+                    <a:blip r:embed="rId10" cstate="print">
+                      <a:extLst>
+                        <a:ext uri="{28A0092B-C50C-407E-A947-70E740481C1C}">
+                          <a14:useLocalDpi xmlns:a14="http://schemas.microsoft.com/office/drawing/2010/main" val="0"/>
+                        </a:ext>
+                      </a:extLst>
+                    </a:blip>
+                    <a:srcRect/>
+                    <a:stretch>
+                      <a:fillRect/>
+                    </a:stretch>
+                  </pic:blipFill>
+                  <pic:spPr bwMode="auto">
+                    <a:xfrm>
+                      <a:off x="0" y="0"/>
+                      <a:ext cx="2764790" cy="2781300"/>
+                    </a:xfrm>
+                    <a:prstGeom prst="rect">
+                      <a:avLst/>
+                    </a:prstGeom>
+                    <a:noFill/>
+                    <a:ln>
+                      <a:noFill/>
+                    </a:ln>
+                  </pic:spPr>
+                </pic:pic>
+              </a:graphicData>
+            </a:graphic>
+            <wp14:sizeRelH relativeFrom="margin">
+              <wp14:pctWidth>0</wp14:pctWidth>
+            </wp14:sizeRelH>
+            <wp14:sizeRelV relativeFrom="margin">
+              <wp14:pctHeight>0</wp14:pctHeight>
+            </wp14:sizeRelV>
+          </wp:anchor>
+        </w:drawing>
+      </w:r>
+      <w:r>
+        <w:rPr>
+          <w:noProof/>
+        </w:rPr>
+        <w:drawing>
+          <wp:anchor distT="0" distB="0" distL="114300" distR="114300" simplePos="0" relativeHeight="251674624" behindDoc="0" locked="0" layoutInCell="1" allowOverlap="1" wp14:anchorId="455EB377" wp14:editId="657570C3">
+            <wp:simplePos x="0" y="0"/>
+            <wp:positionH relativeFrom="margin">
+              <wp:align>left</wp:align>
+            </wp:positionH>
+            <wp:positionV relativeFrom="paragraph">
+              <wp:posOffset>426720</wp:posOffset>
+            </wp:positionV>
+            <wp:extent cx="2788920" cy="2788920"/>
+            <wp:effectExtent l="0" t="0" r="0" b="0"/>
+            <wp:wrapTopAndBottom/>
+            <wp:docPr id="1295761410" name="Image 10"/>
+            <wp:cNvGraphicFramePr>
+              <a:graphicFrameLocks xmlns:a="http://schemas.openxmlformats.org/drawingml/2006/main" noChangeAspect="1"/>
+            </wp:cNvGraphicFramePr>
+            <a:graphic xmlns:a="http://schemas.openxmlformats.org/drawingml/2006/main">
+              <a:graphicData uri="http://schemas.openxmlformats.org/drawingml/2006/picture">
+                <pic:pic xmlns:pic="http://schemas.openxmlformats.org/drawingml/2006/picture">
+                  <pic:nvPicPr>
+                    <pic:cNvPr id="0" name="Picture 1"/>
+                    <pic:cNvPicPr>
+                      <a:picLocks noChangeAspect="1" noChangeArrowheads="1"/>
+                    </pic:cNvPicPr>
+                  </pic:nvPicPr>
+                  <pic:blipFill>
+                    <a:blip r:embed="rId11" cstate="print">
+                      <a:extLst>
+                        <a:ext uri="{28A0092B-C50C-407E-A947-70E740481C1C}">
+                          <a14:useLocalDpi xmlns:a14="http://schemas.microsoft.com/office/drawing/2010/main" val="0"/>
+                        </a:ext>
+                      </a:extLst>
+                    </a:blip>
+                    <a:srcRect/>
+                    <a:stretch>
+                      <a:fillRect/>
+                    </a:stretch>
+                  </pic:blipFill>
+                  <pic:spPr bwMode="auto">
+                    <a:xfrm>
+                      <a:off x="0" y="0"/>
+                      <a:ext cx="2788920" cy="2788920"/>
+                    </a:xfrm>
+                    <a:prstGeom prst="rect">
+                      <a:avLst/>
+                    </a:prstGeom>
+                    <a:noFill/>
+                    <a:ln>
+                      <a:noFill/>
+                    </a:ln>
+                  </pic:spPr>
+                </pic:pic>
+              </a:graphicData>
+            </a:graphic>
+            <wp14:sizeRelH relativeFrom="margin">
+              <wp14:pctWidth>0</wp14:pctWidth>
+            </wp14:sizeRelH>
+            <wp14:sizeRelV relativeFrom="margin">
+              <wp14:pctHeight>0</wp14:pctHeight>
+            </wp14:sizeRelV>
+          </wp:anchor>
+        </w:drawing>
+      </w:r>
+      <w:r>
+        <w:t>mais d’autre pas cohérent.</w:t>
       </w:r>
     </w:p>
     <w:p>
@@ -4404,7 +4821,7 @@
         <w:spacing w:after="240"/>
         <w:jc w:val="both"/>
       </w:pPr>
-      <w:bookmarkStart w:id="12" w:name="_Toc230270977"/>
+      <w:bookmarkStart w:id="12" w:name="_Toc230338118"/>
       <w:r>
         <w:t>Traitement OpenCV</w:t>
       </w:r>
@@ -4425,7 +4842,7 @@
         <w:spacing w:after="240"/>
         <w:jc w:val="both"/>
       </w:pPr>
-      <w:bookmarkStart w:id="13" w:name="_Toc230270978"/>
+      <w:bookmarkStart w:id="13" w:name="_Toc230338119"/>
       <w:r>
         <w:t xml:space="preserve">Projection </w:t>
       </w:r>
@@ -4489,7 +4906,7 @@
                     </pic:cNvPicPr>
                   </pic:nvPicPr>
                   <pic:blipFill>
-                    <a:blip r:embed="rId9" cstate="print">
+                    <a:blip r:embed="rId12" cstate="print">
                       <a:extLst>
                         <a:ext uri="{28A0092B-C50C-407E-A947-70E740481C1C}">
                           <a14:useLocalDpi xmlns:a14="http://schemas.microsoft.com/office/drawing/2010/main" val="0"/>
@@ -4578,8 +4995,14 @@
                           <w:p>
                             <w:pPr>
                               <w:jc w:val="center"/>
+                              <w:rPr>
+                                <w:color w:val="4472C4" w:themeColor="accent1"/>
+                              </w:rPr>
                             </w:pPr>
                             <w:r>
+                              <w:rPr>
+                                <w:color w:val="4472C4" w:themeColor="accent1"/>
+                              </w:rPr>
                               <w:t>Première incrustation d’une climatisation avec la bonne taille respecter sur une image stock</w:t>
                             </w:r>
                           </w:p>
@@ -4602,14 +5025,20 @@
           </mc:Choice>
           <mc:Fallback>
             <w:pict>
-              <v:shape w14:anchorId="0737E823" id="Zone de texte 2" o:spid="_x0000_s1028" type="#_x0000_t202" style="position:absolute;left:0;text-align:left;margin-left:229pt;margin-top:204.5pt;width:280.2pt;height:36pt;z-index:251666432;visibility:visible;mso-wrap-style:square;mso-width-percent:0;mso-height-percent:0;mso-wrap-distance-left:9pt;mso-wrap-distance-top:3.6pt;mso-wrap-distance-right:9pt;mso-wrap-distance-bottom:3.6pt;mso-position-horizontal:right;mso-position-horizontal-relative:margin;mso-position-vertical:absolute;mso-position-vertical-relative:text;mso-width-percent:0;mso-height-percent:0;mso-width-relative:margin;mso-height-relative:margin;v-text-anchor:top" o:gfxdata="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">
+              <v:shape w14:anchorId="0737E823" id="_x0000_s1030" type="#_x0000_t202" style="position:absolute;left:0;text-align:left;margin-left:229pt;margin-top:204.5pt;width:280.2pt;height:36pt;z-index:251666432;visibility:visible;mso-wrap-style:square;mso-width-percent:0;mso-height-percent:0;mso-wrap-distance-left:9pt;mso-wrap-distance-top:3.6pt;mso-wrap-distance-right:9pt;mso-wrap-distance-bottom:3.6pt;mso-position-horizontal:right;mso-position-horizontal-relative:margin;mso-position-vertical:absolute;mso-position-vertical-relative:text;mso-width-percent:0;mso-height-percent:0;mso-width-relative:margin;mso-height-relative:margin;v-text-anchor:top" o:gfxdata="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">
                 <v:textbox>
                   <w:txbxContent>
                     <w:p>
                       <w:pPr>
                         <w:jc w:val="center"/>
+                        <w:rPr>
+                          <w:color w:val="4472C4" w:themeColor="accent1"/>
+                        </w:rPr>
                       </w:pPr>
                       <w:r>
+                        <w:rPr>
+                          <w:color w:val="4472C4" w:themeColor="accent1"/>
+                        </w:rPr>
                         <w:t>Première incrustation d’une climatisation avec la bonne taille respecter sur une image stock</w:t>
                       </w:r>
                     </w:p>
@@ -4673,9 +5102,8 @@
         <w:spacing w:after="240"/>
         <w:jc w:val="both"/>
       </w:pPr>
-      <w:bookmarkStart w:id="14" w:name="_Toc230270979"/>
-      <w:r>
-        <w:lastRenderedPageBreak/>
+      <w:bookmarkStart w:id="14" w:name="_Toc230338120"/>
+      <w:r>
         <w:t xml:space="preserve">Éclairage, </w:t>
       </w:r>
       <w:r>
@@ -4744,7 +5172,7 @@
         <w:spacing w:after="240"/>
         <w:jc w:val="both"/>
       </w:pPr>
-      <w:bookmarkStart w:id="15" w:name="_Toc230270980"/>
+      <w:bookmarkStart w:id="15" w:name="_Toc230338121"/>
       <w:r>
         <w:t xml:space="preserve">Modélisation </w:t>
       </w:r>
@@ -4845,7 +5273,7 @@
                     </pic:cNvPicPr>
                   </pic:nvPicPr>
                   <pic:blipFill>
-                    <a:blip r:embed="rId10" cstate="print">
+                    <a:blip r:embed="rId13" cstate="print">
                       <a:extLst>
                         <a:ext uri="{28A0092B-C50C-407E-A947-70E740481C1C}">
                           <a14:useLocalDpi xmlns:a14="http://schemas.microsoft.com/office/drawing/2010/main" val="0"/>
@@ -4928,8 +5356,14 @@
                           <w:p>
                             <w:pPr>
                               <w:jc w:val="center"/>
+                              <w:rPr>
+                                <w:color w:val="4472C4" w:themeColor="accent1"/>
+                              </w:rPr>
                             </w:pPr>
                             <w:r>
+                              <w:rPr>
+                                <w:color w:val="4472C4" w:themeColor="accent1"/>
+                              </w:rPr>
                               <w:t>Incrustation d’une unité extérieur avec la profondeur/volume apparent en fonction de la position de celle-ci dans la photo</w:t>
                             </w:r>
                           </w:p>
@@ -4952,14 +5386,20 @@
           </mc:Choice>
           <mc:Fallback>
             <w:pict>
-              <v:shape w14:anchorId="19D0D49E" id="_x0000_s1029" type="#_x0000_t202" style="position:absolute;left:0;text-align:left;margin-left:178pt;margin-top:233pt;width:229.2pt;height:52.2pt;z-index:251669504;visibility:visible;mso-wrap-style:square;mso-width-percent:0;mso-height-percent:0;mso-wrap-distance-left:9pt;mso-wrap-distance-top:3.6pt;mso-wrap-distance-right:9pt;mso-wrap-distance-bottom:3.6pt;mso-position-horizontal:right;mso-position-horizontal-relative:margin;mso-position-vertical:absolute;mso-position-vertical-relative:text;mso-width-percent:0;mso-height-percent:0;mso-width-relative:margin;mso-height-relative:margin;v-text-anchor:top" o:gfxdata="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">
+              <v:shape w14:anchorId="19D0D49E" id="_x0000_s1031" type="#_x0000_t202" style="position:absolute;left:0;text-align:left;margin-left:178pt;margin-top:233pt;width:229.2pt;height:52.2pt;z-index:251669504;visibility:visible;mso-wrap-style:square;mso-width-percent:0;mso-height-percent:0;mso-wrap-distance-left:9pt;mso-wrap-distance-top:3.6pt;mso-wrap-distance-right:9pt;mso-wrap-distance-bottom:3.6pt;mso-position-horizontal:right;mso-position-horizontal-relative:margin;mso-position-vertical:absolute;mso-position-vertical-relative:text;mso-width-percent:0;mso-height-percent:0;mso-width-relative:margin;mso-height-relative:margin;v-text-anchor:top" o:gfxdata="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">
                 <v:textbox>
                   <w:txbxContent>
                     <w:p>
                       <w:pPr>
                         <w:jc w:val="center"/>
+                        <w:rPr>
+                          <w:color w:val="4472C4" w:themeColor="accent1"/>
+                        </w:rPr>
                       </w:pPr>
                       <w:r>
+                        <w:rPr>
+                          <w:color w:val="4472C4" w:themeColor="accent1"/>
+                        </w:rPr>
                         <w:t>Incrustation d’une unité extérieur avec la profondeur/volume apparent en fonction de la position de celle-ci dans la photo</w:t>
                       </w:r>
                     </w:p>
@@ -5023,7 +5463,7 @@
         <w:spacing w:after="240"/>
         <w:jc w:val="both"/>
       </w:pPr>
-      <w:bookmarkStart w:id="16" w:name="_Toc230270981"/>
+      <w:bookmarkStart w:id="16" w:name="_Toc230338122"/>
       <w:r>
         <w:lastRenderedPageBreak/>
         <w:t xml:space="preserve">Création de </w:t>
@@ -5063,7 +5503,7 @@
         <w:spacing w:after="240"/>
         <w:jc w:val="both"/>
       </w:pPr>
-      <w:bookmarkStart w:id="17" w:name="_Toc230270982"/>
+      <w:bookmarkStart w:id="17" w:name="_Toc230338123"/>
       <w:r>
         <w:t>Architecture et Gestion d'État</w:t>
       </w:r>
@@ -5113,7 +5553,7 @@
         <w:spacing w:after="240"/>
         <w:jc w:val="both"/>
       </w:pPr>
-      <w:bookmarkStart w:id="18" w:name="_Toc230270983"/>
+      <w:bookmarkStart w:id="18" w:name="_Toc230338124"/>
       <w:r>
         <w:t>Outil de Capture Gyroscopique</w:t>
       </w:r>
@@ -5187,7 +5627,7 @@
         <w:spacing w:after="240"/>
         <w:jc w:val="both"/>
       </w:pPr>
-      <w:bookmarkStart w:id="19" w:name="_Toc230270984"/>
+      <w:bookmarkStart w:id="19" w:name="_Toc230338125"/>
       <w:r>
         <w:lastRenderedPageBreak/>
         <w:t>Incrustation des Goulottes</w:t>
@@ -5229,7 +5669,7 @@
                     </pic:cNvPicPr>
                   </pic:nvPicPr>
                   <pic:blipFill>
-                    <a:blip r:embed="rId11" cstate="print">
+                    <a:blip r:embed="rId14" cstate="print">
                       <a:extLst>
                         <a:ext uri="{28A0092B-C50C-407E-A947-70E740481C1C}">
                           <a14:useLocalDpi xmlns:a14="http://schemas.microsoft.com/office/drawing/2010/main" val="0"/>
@@ -5308,7 +5748,7 @@
         <w:spacing w:after="240"/>
         <w:jc w:val="both"/>
       </w:pPr>
-      <w:bookmarkStart w:id="20" w:name="_Toc230270985"/>
+      <w:bookmarkStart w:id="20" w:name="_Toc230338126"/>
       <w:r>
         <w:t>Interface Utilisateur</w:t>
       </w:r>
@@ -5341,7 +5781,7 @@
         <w:spacing w:after="240"/>
         <w:jc w:val="both"/>
       </w:pPr>
-      <w:bookmarkStart w:id="21" w:name="_Toc230270986"/>
+      <w:bookmarkStart w:id="21" w:name="_Toc230338127"/>
       <w:r>
         <w:lastRenderedPageBreak/>
         <w:t>Perspective d’Amélioration</w:t>
@@ -5372,10 +5812,13 @@
         <w:jc w:val="both"/>
       </w:pPr>
       <w:r>
-        <w:t xml:space="preserve">Enfin, sur le plan administratif, ce simulateur visuel pourrait être couplé au système de gestion de l'entreprise. L'intégration d'un module de génération de documents permettrait de compiler automatiquement les photographies de comparaison « Avant/Après », les caractéristiques techniques de la machine sélectionnée et le schéma des goulottes au sein d'un devis PDF complet, prêt à être signé par le client à l'issue de la </w:t>
-      </w:r>
-      <w:r>
-        <w:t>démonstration.</w:t>
+        <w:t xml:space="preserve">Enfin, sur le plan administratif, ce simulateur visuel pourrait être couplé au système de gestion de l'entreprise. L'intégration d'un module de génération de documents permettrait de compiler automatiquement les photographies de comparaison « Avant/Après », les caractéristiques techniques de la machine sélectionnée et le schéma des goulottes au sein d'un devis PDF complet, prêt à être signé par le client </w:t>
+      </w:r>
+      <w:r>
+        <w:t>à l’issus de la démonstration</w:t>
+      </w:r>
+      <w:r>
+        <w:t>.</w:t>
       </w:r>
     </w:p>
     <w:p>
@@ -5384,7 +5827,7 @@
         <w:spacing w:after="240"/>
         <w:jc w:val="both"/>
       </w:pPr>
-      <w:bookmarkStart w:id="22" w:name="_Toc230270987"/>
+      <w:bookmarkStart w:id="22" w:name="_Toc230338128"/>
       <w:r>
         <w:t>Conclusion</w:t>
       </w:r>
@@ -5432,15 +5875,18 @@
         <w:jc w:val="both"/>
       </w:pPr>
       <w:r>
+        <w:t xml:space="preserve">Enfin, au-delà des aspects purement techniques, ce stage a été une expérience humaine très enrichissante. L'accueil de l'équipe et la compréhension des enjeux commerciaux ont donné du sens à </w:t>
+      </w:r>
+      <w:r>
         <w:lastRenderedPageBreak/>
-        <w:t>Enfin, au-delà des aspects purement techniques, ce stage a été une expérience humaine très enrichissante. L'accueil de l'équipe et la compréhension des enjeux commerciaux ont donné du sens à mon travail, en me montrant l’impact direct qu'une application bien pensée peut avoir sur la stratégie de vente d'une entreprise. Ce projet clôturant mon Master m’a définitivement conforté dans mon choix de poursuivre ma carrière dans le domaine de l’intelligence artificielle et de l'ingénierie logicielle en gardant toujours une attention particulière portée à l'expérience utilisateur et à l’utilité concrète des outils que nous concevons.</w:t>
+        <w:t>mon travail, en me montrant l’impact direct qu'une application bien pensée peut avoir sur la stratégie de vente d'une entreprise. Ce projet clôturant mon Master m’a définitivement conforté dans mon choix de poursuivre ma carrière dans le domaine de l’intelligence artificielle et de l'ingénierie logicielle en gardant toujours une attention particulière portée à l'expérience utilisateur et à l’utilité concrète des outils que nous concevons.</w:t>
       </w:r>
     </w:p>
     <w:sectPr>
-      <w:headerReference w:type="even" r:id="rId12"/>
-      <w:headerReference w:type="default" r:id="rId13"/>
-      <w:footerReference w:type="even" r:id="rId14"/>
-      <w:footerReference w:type="default" r:id="rId15"/>
+      <w:headerReference w:type="even" r:id="rId15"/>
+      <w:headerReference w:type="default" r:id="rId16"/>
+      <w:footerReference w:type="even" r:id="rId17"/>
+      <w:footerReference w:type="default" r:id="rId18"/>
       <w:pgSz w:w="11906" w:h="16838"/>
       <w:pgMar w:top="1417" w:right="1417" w:bottom="1417" w:left="1417" w:header="708" w:footer="708" w:gutter="0"/>
       <w:pgNumType w:start="0"/>
@@ -7225,7 +7671,6 @@
   <w:style w:type="character" w:default="1" w:styleId="Policepardfaut">
     <w:name w:val="Default Paragraph Font"/>
     <w:uiPriority w:val="1"/>
-    <w:semiHidden/>
     <w:unhideWhenUsed/>
   </w:style>
   <w:style w:type="table" w:default="1" w:styleId="TableauNormal">

</xml_diff>

<commit_message>
Powerpoint et rapport fini + nouvel architecture de l'application
</commit_message>
<xml_diff>
--- a/rapport_stage_m2_soitel_remi.docx
+++ b/rapport_stage_m2_soitel_remi.docx
@@ -164,7 +164,6 @@
                                     <w:alias w:val="Sous-titre"/>
                                     <w:tag w:val=""/>
                                     <w:id w:val="2021743002"/>
-                                    <w:showingPlcHdr/>
                                     <w:dataBinding w:prefixMappings="xmlns:ns0='http://purl.org/dc/elements/1.1/' xmlns:ns1='http://schemas.openxmlformats.org/package/2006/metadata/core-properties' " w:xpath="/ns1:coreProperties[1]/ns0:subject[1]" w:storeItemID="{6C3C8BC8-F283-45AE-878A-BAB7291924A1}"/>
                                     <w:text/>
                                   </w:sdtPr>
@@ -175,7 +174,23 @@
                                         <w:sz w:val="36"/>
                                         <w:szCs w:val="36"/>
                                       </w:rPr>
-                                      <w:t>[Sous-titre du document]</w:t>
+                                      <w:t>Développement d'une application d</w:t>
+                                    </w:r>
+                                    <w:r>
+                                      <w:rPr>
+                                        <w:color w:val="4472C4" w:themeColor="accent1"/>
+                                        <w:sz w:val="36"/>
+                                        <w:szCs w:val="36"/>
+                                      </w:rPr>
+                                      <w:t>’incrustation</w:t>
+                                    </w:r>
+                                    <w:r>
+                                      <w:rPr>
+                                        <w:color w:val="4472C4" w:themeColor="accent1"/>
+                                        <w:sz w:val="36"/>
+                                        <w:szCs w:val="36"/>
+                                      </w:rPr>
+                                      <w:t xml:space="preserve"> visuelle d'équipements thermiques et de climatisations par Intelligence Artificielle</w:t>
                                     </w:r>
                                   </w:sdtContent>
                                 </w:sdt>
@@ -275,7 +290,6 @@
                               <w:alias w:val="Sous-titre"/>
                               <w:tag w:val=""/>
                               <w:id w:val="2021743002"/>
-                              <w:showingPlcHdr/>
                               <w:dataBinding w:prefixMappings="xmlns:ns0='http://purl.org/dc/elements/1.1/' xmlns:ns1='http://schemas.openxmlformats.org/package/2006/metadata/core-properties' " w:xpath="/ns1:coreProperties[1]/ns0:subject[1]" w:storeItemID="{6C3C8BC8-F283-45AE-878A-BAB7291924A1}"/>
                               <w:text/>
                             </w:sdtPr>
@@ -286,7 +300,23 @@
                                   <w:sz w:val="36"/>
                                   <w:szCs w:val="36"/>
                                 </w:rPr>
-                                <w:t>[Sous-titre du document]</w:t>
+                                <w:t>Développement d'une application d</w:t>
+                              </w:r>
+                              <w:r>
+                                <w:rPr>
+                                  <w:color w:val="4472C4" w:themeColor="accent1"/>
+                                  <w:sz w:val="36"/>
+                                  <w:szCs w:val="36"/>
+                                </w:rPr>
+                                <w:t>’incrustation</w:t>
+                              </w:r>
+                              <w:r>
+                                <w:rPr>
+                                  <w:color w:val="4472C4" w:themeColor="accent1"/>
+                                  <w:sz w:val="36"/>
+                                  <w:szCs w:val="36"/>
+                                </w:rPr>
+                                <w:t xml:space="preserve"> visuelle d'équipements thermiques et de climatisations par Intelligence Artificielle</w:t>
                               </w:r>
                             </w:sdtContent>
                           </w:sdt>
@@ -814,7 +844,7 @@
               </mc:Choice>
               <mc:Fallback>
                 <w:pict>
-                  <v:group w14:anchorId="46FF921C" id="Groupe 2" o:spid="_x0000_s1026" style="position:absolute;margin-left:0;margin-top:0;width:432.65pt;height:448.55pt;z-index:-251656192;mso-width-percent:706;mso-height-percent:566;mso-left-percent:220;mso-top-percent:300;mso-position-horizontal-relative:page;mso-position-vertical-relative:page;mso-width-percent:706;mso-height-percent:566;mso-left-percent:220;mso-top-percent:300" coordsize="43291,44910" o:gfxdata="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">
+                  <v:group w14:anchorId="3D88C132" id="Groupe 2" o:spid="_x0000_s1026" style="position:absolute;margin-left:0;margin-top:0;width:432.65pt;height:448.55pt;z-index:-251656192;mso-width-percent:706;mso-height-percent:566;mso-left-percent:220;mso-top-percent:300;mso-position-horizontal-relative:page;mso-position-vertical-relative:page;mso-width-percent:706;mso-height-percent:566;mso-left-percent:220;mso-top-percent:300" coordsize="43291,44910" o:gfxdata="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">
                     <o:lock v:ext="edit" aspectratio="t"/>
                     <v:shape id="Forme libre 64" o:spid="_x0000_s1027" style="position:absolute;left:15017;width:28274;height:28352;visibility:visible;mso-wrap-style:square;v-text-anchor:top" coordsize="1781,1786" o:gfxdata="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" path="m4,1786l,1782,1776,r5,5l4,1786xe" filled="f" stroked="f">
                       <v:path arrowok="t" o:connecttype="custom" o:connectlocs="6350,2835275;0,2828925;2819400,0;2827338,7938;6350,2835275" o:connectangles="0,0,0,0,0"/>
@@ -1271,7 +1301,7 @@
           <w:r>
             <w:fldChar w:fldCharType="separate"/>
           </w:r>
-          <w:hyperlink w:anchor="_Toc230338106" w:history="1">
+          <w:hyperlink w:anchor="_Toc231375583" w:history="1">
             <w:r>
               <w:rPr>
                 <w:rStyle w:val="Lienhypertexte"/>
@@ -1317,7 +1347,7 @@
                 <w:noProof/>
                 <w:webHidden/>
               </w:rPr>
-              <w:instrText xml:space="preserve"> PAGEREF _Toc230338106 \h </w:instrText>
+              <w:instrText xml:space="preserve"> PAGEREF _Toc231375583 \h </w:instrText>
             </w:r>
             <w:r>
               <w:rPr>
@@ -1365,7 +1395,7 @@
               <w14:ligatures w14:val="standardContextual"/>
             </w:rPr>
           </w:pPr>
-          <w:hyperlink w:anchor="_Toc230338107" w:history="1">
+          <w:hyperlink w:anchor="_Toc231375584" w:history="1">
             <w:r>
               <w:rPr>
                 <w:rStyle w:val="Lienhypertexte"/>
@@ -1411,7 +1441,7 @@
                 <w:noProof/>
                 <w:webHidden/>
               </w:rPr>
-              <w:instrText xml:space="preserve"> PAGEREF _Toc230338107 \h </w:instrText>
+              <w:instrText xml:space="preserve"> PAGEREF _Toc231375584 \h </w:instrText>
             </w:r>
             <w:r>
               <w:rPr>
@@ -1459,7 +1489,7 @@
               <w14:ligatures w14:val="standardContextual"/>
             </w:rPr>
           </w:pPr>
-          <w:hyperlink w:anchor="_Toc230338108" w:history="1">
+          <w:hyperlink w:anchor="_Toc231375585" w:history="1">
             <w:r>
               <w:rPr>
                 <w:rStyle w:val="Lienhypertexte"/>
@@ -1505,7 +1535,7 @@
                 <w:noProof/>
                 <w:webHidden/>
               </w:rPr>
-              <w:instrText xml:space="preserve"> PAGEREF _Toc230338108 \h </w:instrText>
+              <w:instrText xml:space="preserve"> PAGEREF _Toc231375585 \h </w:instrText>
             </w:r>
             <w:r>
               <w:rPr>
@@ -1553,7 +1583,7 @@
               <w14:ligatures w14:val="standardContextual"/>
             </w:rPr>
           </w:pPr>
-          <w:hyperlink w:anchor="_Toc230338109" w:history="1">
+          <w:hyperlink w:anchor="_Toc231375586" w:history="1">
             <w:r>
               <w:rPr>
                 <w:rStyle w:val="Lienhypertexte"/>
@@ -1599,7 +1629,7 @@
                 <w:noProof/>
                 <w:webHidden/>
               </w:rPr>
-              <w:instrText xml:space="preserve"> PAGEREF _Toc230338109 \h </w:instrText>
+              <w:instrText xml:space="preserve"> PAGEREF _Toc231375586 \h </w:instrText>
             </w:r>
             <w:r>
               <w:rPr>
@@ -1647,7 +1677,7 @@
               <w14:ligatures w14:val="standardContextual"/>
             </w:rPr>
           </w:pPr>
-          <w:hyperlink w:anchor="_Toc230338110" w:history="1">
+          <w:hyperlink w:anchor="_Toc231375587" w:history="1">
             <w:r>
               <w:rPr>
                 <w:rStyle w:val="Lienhypertexte"/>
@@ -1693,7 +1723,7 @@
                 <w:noProof/>
                 <w:webHidden/>
               </w:rPr>
-              <w:instrText xml:space="preserve"> PAGEREF _Toc230338110 \h </w:instrText>
+              <w:instrText xml:space="preserve"> PAGEREF _Toc231375587 \h </w:instrText>
             </w:r>
             <w:r>
               <w:rPr>
@@ -1741,7 +1771,7 @@
               <w14:ligatures w14:val="standardContextual"/>
             </w:rPr>
           </w:pPr>
-          <w:hyperlink w:anchor="_Toc230338111" w:history="1">
+          <w:hyperlink w:anchor="_Toc231375588" w:history="1">
             <w:r>
               <w:rPr>
                 <w:rStyle w:val="Lienhypertexte"/>
@@ -1787,7 +1817,7 @@
                 <w:noProof/>
                 <w:webHidden/>
               </w:rPr>
-              <w:instrText xml:space="preserve"> PAGEREF _Toc230338111 \h </w:instrText>
+              <w:instrText xml:space="preserve"> PAGEREF _Toc231375588 \h </w:instrText>
             </w:r>
             <w:r>
               <w:rPr>
@@ -1835,7 +1865,7 @@
               <w14:ligatures w14:val="standardContextual"/>
             </w:rPr>
           </w:pPr>
-          <w:hyperlink w:anchor="_Toc230338112" w:history="1">
+          <w:hyperlink w:anchor="_Toc231375589" w:history="1">
             <w:r>
               <w:rPr>
                 <w:rStyle w:val="Lienhypertexte"/>
@@ -1881,7 +1911,7 @@
                 <w:noProof/>
                 <w:webHidden/>
               </w:rPr>
-              <w:instrText xml:space="preserve"> PAGEREF _Toc230338112 \h </w:instrText>
+              <w:instrText xml:space="preserve"> PAGEREF _Toc231375589 \h </w:instrText>
             </w:r>
             <w:r>
               <w:rPr>
@@ -1929,7 +1959,7 @@
               <w14:ligatures w14:val="standardContextual"/>
             </w:rPr>
           </w:pPr>
-          <w:hyperlink w:anchor="_Toc230338113" w:history="1">
+          <w:hyperlink w:anchor="_Toc231375590" w:history="1">
             <w:r>
               <w:rPr>
                 <w:rStyle w:val="Lienhypertexte"/>
@@ -1975,7 +2005,7 @@
                 <w:noProof/>
                 <w:webHidden/>
               </w:rPr>
-              <w:instrText xml:space="preserve"> PAGEREF _Toc230338113 \h </w:instrText>
+              <w:instrText xml:space="preserve"> PAGEREF _Toc231375590 \h </w:instrText>
             </w:r>
             <w:r>
               <w:rPr>
@@ -1995,7 +2025,7 @@
                 <w:noProof/>
                 <w:webHidden/>
               </w:rPr>
-              <w:t>4</w:t>
+              <w:t>5</w:t>
             </w:r>
             <w:r>
               <w:rPr>
@@ -2023,7 +2053,7 @@
               <w14:ligatures w14:val="standardContextual"/>
             </w:rPr>
           </w:pPr>
-          <w:hyperlink w:anchor="_Toc230338114" w:history="1">
+          <w:hyperlink w:anchor="_Toc231375591" w:history="1">
             <w:r>
               <w:rPr>
                 <w:rStyle w:val="Lienhypertexte"/>
@@ -2069,7 +2099,7 @@
                 <w:noProof/>
                 <w:webHidden/>
               </w:rPr>
-              <w:instrText xml:space="preserve"> PAGEREF _Toc230338114 \h </w:instrText>
+              <w:instrText xml:space="preserve"> PAGEREF _Toc231375591 \h </w:instrText>
             </w:r>
             <w:r>
               <w:rPr>
@@ -2117,7 +2147,7 @@
               <w14:ligatures w14:val="standardContextual"/>
             </w:rPr>
           </w:pPr>
-          <w:hyperlink w:anchor="_Toc230338115" w:history="1">
+          <w:hyperlink w:anchor="_Toc231375592" w:history="1">
             <w:r>
               <w:rPr>
                 <w:rStyle w:val="Lienhypertexte"/>
@@ -2163,7 +2193,7 @@
                 <w:noProof/>
                 <w:webHidden/>
               </w:rPr>
-              <w:instrText xml:space="preserve"> PAGEREF _Toc230338115 \h </w:instrText>
+              <w:instrText xml:space="preserve"> PAGEREF _Toc231375592 \h </w:instrText>
             </w:r>
             <w:r>
               <w:rPr>
@@ -2211,7 +2241,7 @@
               <w14:ligatures w14:val="standardContextual"/>
             </w:rPr>
           </w:pPr>
-          <w:hyperlink w:anchor="_Toc230338116" w:history="1">
+          <w:hyperlink w:anchor="_Toc231375593" w:history="1">
             <w:r>
               <w:rPr>
                 <w:rStyle w:val="Lienhypertexte"/>
@@ -2257,7 +2287,7 @@
                 <w:noProof/>
                 <w:webHidden/>
               </w:rPr>
-              <w:instrText xml:space="preserve"> PAGEREF _Toc230338116 \h </w:instrText>
+              <w:instrText xml:space="preserve"> PAGEREF _Toc231375593 \h </w:instrText>
             </w:r>
             <w:r>
               <w:rPr>
@@ -2277,7 +2307,7 @@
                 <w:noProof/>
                 <w:webHidden/>
               </w:rPr>
-              <w:t>5</w:t>
+              <w:t>6</w:t>
             </w:r>
             <w:r>
               <w:rPr>
@@ -2305,7 +2335,7 @@
               <w14:ligatures w14:val="standardContextual"/>
             </w:rPr>
           </w:pPr>
-          <w:hyperlink w:anchor="_Toc230338117" w:history="1">
+          <w:hyperlink w:anchor="_Toc231375594" w:history="1">
             <w:r>
               <w:rPr>
                 <w:rStyle w:val="Lienhypertexte"/>
@@ -2351,7 +2381,7 @@
                 <w:noProof/>
                 <w:webHidden/>
               </w:rPr>
-              <w:instrText xml:space="preserve"> PAGEREF _Toc230338117 \h </w:instrText>
+              <w:instrText xml:space="preserve"> PAGEREF _Toc231375594 \h </w:instrText>
             </w:r>
             <w:r>
               <w:rPr>
@@ -2399,7 +2429,7 @@
               <w14:ligatures w14:val="standardContextual"/>
             </w:rPr>
           </w:pPr>
-          <w:hyperlink w:anchor="_Toc230338118" w:history="1">
+          <w:hyperlink w:anchor="_Toc231375595" w:history="1">
             <w:r>
               <w:rPr>
                 <w:rStyle w:val="Lienhypertexte"/>
@@ -2445,7 +2475,7 @@
                 <w:noProof/>
                 <w:webHidden/>
               </w:rPr>
-              <w:instrText xml:space="preserve"> PAGEREF _Toc230338118 \h </w:instrText>
+              <w:instrText xml:space="preserve"> PAGEREF _Toc231375595 \h </w:instrText>
             </w:r>
             <w:r>
               <w:rPr>
@@ -2493,7 +2523,7 @@
               <w14:ligatures w14:val="standardContextual"/>
             </w:rPr>
           </w:pPr>
-          <w:hyperlink w:anchor="_Toc230338119" w:history="1">
+          <w:hyperlink w:anchor="_Toc231375596" w:history="1">
             <w:r>
               <w:rPr>
                 <w:rStyle w:val="Lienhypertexte"/>
@@ -2539,7 +2569,7 @@
                 <w:noProof/>
                 <w:webHidden/>
               </w:rPr>
-              <w:instrText xml:space="preserve"> PAGEREF _Toc230338119 \h </w:instrText>
+              <w:instrText xml:space="preserve"> PAGEREF _Toc231375596 \h </w:instrText>
             </w:r>
             <w:r>
               <w:rPr>
@@ -2587,7 +2617,7 @@
               <w14:ligatures w14:val="standardContextual"/>
             </w:rPr>
           </w:pPr>
-          <w:hyperlink w:anchor="_Toc230338120" w:history="1">
+          <w:hyperlink w:anchor="_Toc231375597" w:history="1">
             <w:r>
               <w:rPr>
                 <w:rStyle w:val="Lienhypertexte"/>
@@ -2633,7 +2663,7 @@
                 <w:noProof/>
                 <w:webHidden/>
               </w:rPr>
-              <w:instrText xml:space="preserve"> PAGEREF _Toc230338120 \h </w:instrText>
+              <w:instrText xml:space="preserve"> PAGEREF _Toc231375597 \h </w:instrText>
             </w:r>
             <w:r>
               <w:rPr>
@@ -2681,7 +2711,7 @@
               <w14:ligatures w14:val="standardContextual"/>
             </w:rPr>
           </w:pPr>
-          <w:hyperlink w:anchor="_Toc230338121" w:history="1">
+          <w:hyperlink w:anchor="_Toc231375598" w:history="1">
             <w:r>
               <w:rPr>
                 <w:rStyle w:val="Lienhypertexte"/>
@@ -2727,7 +2757,7 @@
                 <w:noProof/>
                 <w:webHidden/>
               </w:rPr>
-              <w:instrText xml:space="preserve"> PAGEREF _Toc230338121 \h </w:instrText>
+              <w:instrText xml:space="preserve"> PAGEREF _Toc231375598 \h </w:instrText>
             </w:r>
             <w:r>
               <w:rPr>
@@ -2775,7 +2805,7 @@
               <w14:ligatures w14:val="standardContextual"/>
             </w:rPr>
           </w:pPr>
-          <w:hyperlink w:anchor="_Toc230338122" w:history="1">
+          <w:hyperlink w:anchor="_Toc231375599" w:history="1">
             <w:r>
               <w:rPr>
                 <w:rStyle w:val="Lienhypertexte"/>
@@ -2821,7 +2851,7 @@
                 <w:noProof/>
                 <w:webHidden/>
               </w:rPr>
-              <w:instrText xml:space="preserve"> PAGEREF _Toc230338122 \h </w:instrText>
+              <w:instrText xml:space="preserve"> PAGEREF _Toc231375599 \h </w:instrText>
             </w:r>
             <w:r>
               <w:rPr>
@@ -2869,7 +2899,7 @@
               <w14:ligatures w14:val="standardContextual"/>
             </w:rPr>
           </w:pPr>
-          <w:hyperlink w:anchor="_Toc230338123" w:history="1">
+          <w:hyperlink w:anchor="_Toc231375600" w:history="1">
             <w:r>
               <w:rPr>
                 <w:rStyle w:val="Lienhypertexte"/>
@@ -2915,7 +2945,7 @@
                 <w:noProof/>
                 <w:webHidden/>
               </w:rPr>
-              <w:instrText xml:space="preserve"> PAGEREF _Toc230338123 \h </w:instrText>
+              <w:instrText xml:space="preserve"> PAGEREF _Toc231375600 \h </w:instrText>
             </w:r>
             <w:r>
               <w:rPr>
@@ -2963,7 +2993,7 @@
               <w14:ligatures w14:val="standardContextual"/>
             </w:rPr>
           </w:pPr>
-          <w:hyperlink w:anchor="_Toc230338124" w:history="1">
+          <w:hyperlink w:anchor="_Toc231375601" w:history="1">
             <w:r>
               <w:rPr>
                 <w:rStyle w:val="Lienhypertexte"/>
@@ -3009,7 +3039,7 @@
                 <w:noProof/>
                 <w:webHidden/>
               </w:rPr>
-              <w:instrText xml:space="preserve"> PAGEREF _Toc230338124 \h </w:instrText>
+              <w:instrText xml:space="preserve"> PAGEREF _Toc231375601 \h </w:instrText>
             </w:r>
             <w:r>
               <w:rPr>
@@ -3057,7 +3087,7 @@
               <w14:ligatures w14:val="standardContextual"/>
             </w:rPr>
           </w:pPr>
-          <w:hyperlink w:anchor="_Toc230338125" w:history="1">
+          <w:hyperlink w:anchor="_Toc231375602" w:history="1">
             <w:r>
               <w:rPr>
                 <w:rStyle w:val="Lienhypertexte"/>
@@ -3103,7 +3133,7 @@
                 <w:noProof/>
                 <w:webHidden/>
               </w:rPr>
-              <w:instrText xml:space="preserve"> PAGEREF _Toc230338125 \h </w:instrText>
+              <w:instrText xml:space="preserve"> PAGEREF _Toc231375602 \h </w:instrText>
             </w:r>
             <w:r>
               <w:rPr>
@@ -3151,7 +3181,7 @@
               <w14:ligatures w14:val="standardContextual"/>
             </w:rPr>
           </w:pPr>
-          <w:hyperlink w:anchor="_Toc230338126" w:history="1">
+          <w:hyperlink w:anchor="_Toc231375603" w:history="1">
             <w:r>
               <w:rPr>
                 <w:rStyle w:val="Lienhypertexte"/>
@@ -3197,7 +3227,7 @@
                 <w:noProof/>
                 <w:webHidden/>
               </w:rPr>
-              <w:instrText xml:space="preserve"> PAGEREF _Toc230338126 \h </w:instrText>
+              <w:instrText xml:space="preserve"> PAGEREF _Toc231375603 \h </w:instrText>
             </w:r>
             <w:r>
               <w:rPr>
@@ -3245,7 +3275,7 @@
               <w14:ligatures w14:val="standardContextual"/>
             </w:rPr>
           </w:pPr>
-          <w:hyperlink w:anchor="_Toc230338127" w:history="1">
+          <w:hyperlink w:anchor="_Toc231375604" w:history="1">
             <w:r>
               <w:rPr>
                 <w:rStyle w:val="Lienhypertexte"/>
@@ -3291,7 +3321,7 @@
                 <w:noProof/>
                 <w:webHidden/>
               </w:rPr>
-              <w:instrText xml:space="preserve"> PAGEREF _Toc230338127 \h </w:instrText>
+              <w:instrText xml:space="preserve"> PAGEREF _Toc231375604 \h </w:instrText>
             </w:r>
             <w:r>
               <w:rPr>
@@ -3339,7 +3369,7 @@
               <w14:ligatures w14:val="standardContextual"/>
             </w:rPr>
           </w:pPr>
-          <w:hyperlink w:anchor="_Toc230338128" w:history="1">
+          <w:hyperlink w:anchor="_Toc231375605" w:history="1">
             <w:r>
               <w:rPr>
                 <w:rStyle w:val="Lienhypertexte"/>
@@ -3385,7 +3415,7 @@
                 <w:noProof/>
                 <w:webHidden/>
               </w:rPr>
-              <w:instrText xml:space="preserve"> PAGEREF _Toc230338128 \h </w:instrText>
+              <w:instrText xml:space="preserve"> PAGEREF _Toc231375605 \h </w:instrText>
             </w:r>
             <w:r>
               <w:rPr>
@@ -3452,7 +3482,7 @@
         <w:spacing w:after="240"/>
         <w:jc w:val="both"/>
       </w:pPr>
-      <w:bookmarkStart w:id="0" w:name="_Toc230338106"/>
+      <w:bookmarkStart w:id="0" w:name="_Toc231375583"/>
       <w:r>
         <w:lastRenderedPageBreak/>
         <w:t>Remerciement</w:t>
@@ -3516,7 +3546,7 @@
         <w:spacing w:after="240"/>
         <w:jc w:val="both"/>
       </w:pPr>
-      <w:bookmarkStart w:id="1" w:name="_Toc230338107"/>
+      <w:bookmarkStart w:id="1" w:name="_Toc231375584"/>
       <w:r>
         <w:t>Introduction</w:t>
       </w:r>
@@ -3646,7 +3676,7 @@
         <w:spacing w:after="240"/>
         <w:jc w:val="both"/>
       </w:pPr>
-      <w:bookmarkStart w:id="2" w:name="_Toc230338108"/>
+      <w:bookmarkStart w:id="2" w:name="_Toc231375585"/>
       <w:r>
         <w:lastRenderedPageBreak/>
         <w:t>Objectif du Projet</w:t>
@@ -3659,7 +3689,7 @@
         <w:spacing w:after="240"/>
         <w:jc w:val="both"/>
       </w:pPr>
-      <w:bookmarkStart w:id="3" w:name="_Toc230338109"/>
+      <w:bookmarkStart w:id="3" w:name="_Toc231375586"/>
       <w:r>
         <w:t>Contexte et Problématique</w:t>
       </w:r>
@@ -3812,7 +3842,7 @@
         <w:spacing w:after="240"/>
         <w:jc w:val="both"/>
       </w:pPr>
-      <w:bookmarkStart w:id="4" w:name="_Toc230338110"/>
+      <w:bookmarkStart w:id="4" w:name="_Toc231375587"/>
       <w:r>
         <w:t>Les Différents choix d’Implémentations</w:t>
       </w:r>
@@ -3842,7 +3872,7 @@
         <w:spacing w:after="240"/>
         <w:jc w:val="both"/>
       </w:pPr>
-      <w:bookmarkStart w:id="5" w:name="_Toc230338111"/>
+      <w:bookmarkStart w:id="5" w:name="_Toc231375588"/>
       <w:r>
         <w:t>Utilisation d’un Autocollant Physique</w:t>
       </w:r>
@@ -3968,12 +3998,200 @@
       <w:r>
         <w:t xml:space="preserve"> conserve une excellente précision pour détecter une forme géométrique simple et normée comme notre autocollant tout en garantissant un traitement quasi instantané et une faible consommation énergétique pour l'utilisateur sur le terrain.</w:t>
       </w:r>
+      <w:r>
+        <w:rPr>
+          <w:noProof/>
+        </w:rPr>
+        <w:t xml:space="preserve"> </w:t>
+      </w:r>
     </w:p>
     <w:p>
       <w:pPr>
         <w:ind w:firstLine="708"/>
         <w:jc w:val="both"/>
       </w:pPr>
+      <w:r>
+        <w:rPr>
+          <w:noProof/>
+        </w:rPr>
+        <mc:AlternateContent>
+          <mc:Choice Requires="wps">
+            <w:drawing>
+              <wp:anchor distT="45720" distB="45720" distL="114300" distR="114300" simplePos="0" relativeHeight="251680768" behindDoc="0" locked="0" layoutInCell="1" allowOverlap="1" wp14:anchorId="04DF7618" wp14:editId="0A53DE51">
+                <wp:simplePos x="0" y="0"/>
+                <wp:positionH relativeFrom="margin">
+                  <wp:posOffset>3306445</wp:posOffset>
+                </wp:positionH>
+                <wp:positionV relativeFrom="paragraph">
+                  <wp:posOffset>2370455</wp:posOffset>
+                </wp:positionV>
+                <wp:extent cx="2430780" cy="342900"/>
+                <wp:effectExtent l="0" t="0" r="26670" b="19050"/>
+                <wp:wrapSquare wrapText="bothSides"/>
+                <wp:docPr id="1624309665" name="Zone de texte 2"/>
+                <wp:cNvGraphicFramePr>
+                  <a:graphicFrameLocks xmlns:a="http://schemas.openxmlformats.org/drawingml/2006/main"/>
+                </wp:cNvGraphicFramePr>
+                <a:graphic xmlns:a="http://schemas.openxmlformats.org/drawingml/2006/main">
+                  <a:graphicData uri="http://schemas.microsoft.com/office/word/2010/wordprocessingShape">
+                    <wps:wsp>
+                      <wps:cNvSpPr txBox="1">
+                        <a:spLocks noChangeArrowheads="1"/>
+                      </wps:cNvSpPr>
+                      <wps:spPr bwMode="auto">
+                        <a:xfrm>
+                          <a:off x="0" y="0"/>
+                          <a:ext cx="2430780" cy="342900"/>
+                        </a:xfrm>
+                        <a:prstGeom prst="rect">
+                          <a:avLst/>
+                        </a:prstGeom>
+                        <a:solidFill>
+                          <a:srgbClr val="FFFFFF"/>
+                        </a:solidFill>
+                        <a:ln w="9525">
+                          <a:solidFill>
+                            <a:srgbClr val="000000"/>
+                          </a:solidFill>
+                          <a:miter lim="800000"/>
+                          <a:headEnd/>
+                          <a:tailEnd/>
+                        </a:ln>
+                      </wps:spPr>
+                      <wps:txbx>
+                        <w:txbxContent>
+                          <w:p>
+                            <w:pPr>
+                              <w:jc w:val="center"/>
+                              <w:rPr>
+                                <w:color w:val="4472C4" w:themeColor="accent1"/>
+                              </w:rPr>
+                            </w:pPr>
+                            <w:r>
+                              <w:rPr>
+                                <w:color w:val="4472C4" w:themeColor="accent1"/>
+                              </w:rPr>
+                              <w:t>Rouleau d’autocollant utilisé</w:t>
+                            </w:r>
+                          </w:p>
+                        </w:txbxContent>
+                      </wps:txbx>
+                      <wps:bodyPr rot="0" vert="horz" wrap="square" lIns="91440" tIns="45720" rIns="91440" bIns="45720" anchor="t" anchorCtr="0">
+                        <a:noAutofit/>
+                      </wps:bodyPr>
+                    </wps:wsp>
+                  </a:graphicData>
+                </a:graphic>
+                <wp14:sizeRelH relativeFrom="margin">
+                  <wp14:pctWidth>0</wp14:pctWidth>
+                </wp14:sizeRelH>
+                <wp14:sizeRelV relativeFrom="margin">
+                  <wp14:pctHeight>0</wp14:pctHeight>
+                </wp14:sizeRelV>
+              </wp:anchor>
+            </w:drawing>
+          </mc:Choice>
+          <mc:Fallback>
+            <w:pict>
+              <v:shape w14:anchorId="04DF7618" id="Zone de texte 2" o:spid="_x0000_s1028" type="#_x0000_t202" style="position:absolute;left:0;text-align:left;margin-left:260.35pt;margin-top:186.65pt;width:191.4pt;height:27pt;z-index:251680768;visibility:visible;mso-wrap-style:square;mso-width-percent:0;mso-height-percent:0;mso-wrap-distance-left:9pt;mso-wrap-distance-top:3.6pt;mso-wrap-distance-right:9pt;mso-wrap-distance-bottom:3.6pt;mso-position-horizontal:absolute;mso-position-horizontal-relative:margin;mso-position-vertical:absolute;mso-position-vertical-relative:text;mso-width-percent:0;mso-height-percent:0;mso-width-relative:margin;mso-height-relative:margin;v-text-anchor:top" o:gfxdata="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">
+                <v:textbox>
+                  <w:txbxContent>
+                    <w:p>
+                      <w:pPr>
+                        <w:jc w:val="center"/>
+                        <w:rPr>
+                          <w:color w:val="4472C4" w:themeColor="accent1"/>
+                        </w:rPr>
+                      </w:pPr>
+                      <w:r>
+                        <w:rPr>
+                          <w:color w:val="4472C4" w:themeColor="accent1"/>
+                        </w:rPr>
+                        <w:t>Rouleau d’autocollant utilisé</w:t>
+                      </w:r>
+                    </w:p>
+                  </w:txbxContent>
+                </v:textbox>
+                <w10:wrap type="square" anchorx="margin"/>
+              </v:shape>
+            </w:pict>
+          </mc:Fallback>
+        </mc:AlternateContent>
+      </w:r>
+      <w:r>
+        <w:rPr>
+          <w:noProof/>
+        </w:rPr>
+        <w:drawing>
+          <wp:anchor distT="0" distB="0" distL="114300" distR="114300" simplePos="0" relativeHeight="251678720" behindDoc="0" locked="0" layoutInCell="1" allowOverlap="1" wp14:anchorId="7B35DC3D" wp14:editId="2D0BE3EC">
+            <wp:simplePos x="0" y="0"/>
+            <wp:positionH relativeFrom="margin">
+              <wp:align>right</wp:align>
+            </wp:positionH>
+            <wp:positionV relativeFrom="paragraph">
+              <wp:posOffset>15875</wp:posOffset>
+            </wp:positionV>
+            <wp:extent cx="2440305" cy="2278380"/>
+            <wp:effectExtent l="0" t="0" r="0" b="7620"/>
+            <wp:wrapSquare wrapText="bothSides"/>
+            <wp:docPr id="16" name="Image 15">
+              <a:extLst xmlns:a="http://schemas.openxmlformats.org/drawingml/2006/main">
+                <a:ext uri="{FF2B5EF4-FFF2-40B4-BE49-F238E27FC236}">
+                  <a16:creationId xmlns:a16="http://schemas.microsoft.com/office/drawing/2014/main" id="{C37B26BB-1354-D18D-51C6-074E6D99AADE}"/>
+                </a:ext>
+              </a:extLst>
+            </wp:docPr>
+            <wp:cNvGraphicFramePr>
+              <a:graphicFrameLocks xmlns:a="http://schemas.openxmlformats.org/drawingml/2006/main" noChangeAspect="1"/>
+            </wp:cNvGraphicFramePr>
+            <a:graphic xmlns:a="http://schemas.openxmlformats.org/drawingml/2006/main">
+              <a:graphicData uri="http://schemas.openxmlformats.org/drawingml/2006/picture">
+                <pic:pic xmlns:pic="http://schemas.openxmlformats.org/drawingml/2006/picture">
+                  <pic:nvPicPr>
+                    <pic:cNvPr id="16" name="Image 15">
+                      <a:extLst>
+                        <a:ext uri="{FF2B5EF4-FFF2-40B4-BE49-F238E27FC236}">
+                          <a16:creationId xmlns:a16="http://schemas.microsoft.com/office/drawing/2014/main" id="{C37B26BB-1354-D18D-51C6-074E6D99AADE}"/>
+                        </a:ext>
+                      </a:extLst>
+                    </pic:cNvPr>
+                    <pic:cNvPicPr>
+                      <a:picLocks noChangeAspect="1"/>
+                    </pic:cNvPicPr>
+                  </pic:nvPicPr>
+                  <pic:blipFill>
+                    <a:blip r:embed="rId9" cstate="print">
+                      <a:extLst>
+                        <a:ext uri="{28A0092B-C50C-407E-A947-70E740481C1C}">
+                          <a14:useLocalDpi xmlns:a14="http://schemas.microsoft.com/office/drawing/2010/main" val="0"/>
+                        </a:ext>
+                      </a:extLst>
+                    </a:blip>
+                    <a:stretch>
+                      <a:fillRect/>
+                    </a:stretch>
+                  </pic:blipFill>
+                  <pic:spPr>
+                    <a:xfrm>
+                      <a:off x="0" y="0"/>
+                      <a:ext cx="2440305" cy="2278380"/>
+                    </a:xfrm>
+                    <a:prstGeom prst="rect">
+                      <a:avLst/>
+                    </a:prstGeom>
+                  </pic:spPr>
+                </pic:pic>
+              </a:graphicData>
+            </a:graphic>
+            <wp14:sizeRelH relativeFrom="margin">
+              <wp14:pctWidth>0</wp14:pctWidth>
+            </wp14:sizeRelH>
+            <wp14:sizeRelV relativeFrom="margin">
+              <wp14:pctHeight>0</wp14:pctHeight>
+            </wp14:sizeRelV>
+          </wp:anchor>
+        </w:drawing>
+      </w:r>
       <w:r>
         <w:t xml:space="preserve">Le choix des caractéristiques physiques de ce marqueur ne s'est pas fait au hasard. Nous avons opté pour un autocollant d'une dimension exacte de 10 mm par 5 mm, arborant une couleur vert fluo </w:t>
       </w:r>
@@ -3996,7 +4214,7 @@
         <w:spacing w:after="240"/>
         <w:jc w:val="both"/>
       </w:pPr>
-      <w:bookmarkStart w:id="6" w:name="_Toc230338112"/>
+      <w:bookmarkStart w:id="6" w:name="_Toc231375589"/>
       <w:r>
         <w:t>Le choix d’</w:t>
       </w:r>
@@ -4032,7 +4250,11 @@
         <w:t>alité</w:t>
       </w:r>
       <w:r>
-        <w:t xml:space="preserve"> permettant de réaliser des opérations de composition d'images complexes telles que l'ombre portée adaptative et le flou de dégradation photographique</w:t>
+        <w:t xml:space="preserve"> permettant de réaliser des opérations de composition d'images complexes telles que l'ombre portée adaptative et le </w:t>
+      </w:r>
+      <w:r>
+        <w:lastRenderedPageBreak/>
+        <w:t>flou de dégradation photographique</w:t>
       </w:r>
       <w:r>
         <w:t xml:space="preserve"> qui sont</w:t>
@@ -4047,7 +4269,7 @@
         <w:spacing w:after="240"/>
         <w:jc w:val="both"/>
       </w:pPr>
-      <w:bookmarkStart w:id="7" w:name="_Toc230338113"/>
+      <w:bookmarkStart w:id="7" w:name="_Toc231375590"/>
       <w:r>
         <w:t xml:space="preserve">Le Choix de </w:t>
       </w:r>
@@ -4068,11 +4290,7 @@
         <w:t>Framework</w:t>
       </w:r>
       <w:r>
-        <w:t xml:space="preserve"> </w:t>
-      </w:r>
-      <w:r>
-        <w:lastRenderedPageBreak/>
-        <w:t>Flutter basé sur le langage Dart a été sélectionné pour sa capacité à produire des interfaces hautement personnalisables et performantes.</w:t>
+        <w:t xml:space="preserve"> Flutter basé sur le langage Dart a été sélectionné pour sa capacité à produire des interfaces hautement personnalisables et performantes.</w:t>
       </w:r>
       <w:r>
         <w:t xml:space="preserve"> Et bien que nous n’ayons jamais utiliser Flutter auparavant (On utilisait surtout Android Studio), le langage Dart est très similaire à du C++ que nous connaissons bien et un des avantages de flutter c’est que nous n’avons pas à gérer l’application en fonction de l’OS du téléphone, il gère tout tous seul.</w:t>
@@ -4093,7 +4311,7 @@
         <w:spacing w:after="240"/>
         <w:jc w:val="both"/>
       </w:pPr>
-      <w:bookmarkStart w:id="8" w:name="_Toc230338114"/>
+      <w:bookmarkStart w:id="8" w:name="_Toc231375591"/>
       <w:r>
         <w:t>Implémentation</w:t>
       </w:r>
@@ -4157,7 +4375,7 @@
         <w:spacing w:after="240"/>
         <w:jc w:val="both"/>
       </w:pPr>
-      <w:bookmarkStart w:id="9" w:name="_Toc230338115"/>
+      <w:bookmarkStart w:id="9" w:name="_Toc231375592"/>
       <w:r>
         <w:t>Implémentation</w:t>
       </w:r>
@@ -4187,7 +4405,11 @@
         <w:jc w:val="both"/>
       </w:pPr>
       <w:r>
-        <w:t>Le rôle de l'Intelligence Artificielle dans notre application est d'agir comme les « yeux » du système : elle doit d'une part détecter précisément l'autocollant de repère placé sur le mur pour en extraire les coordonnées spatiales, et d'autre part effacer virtuellement cet autocollant de la photographie pour restituer un mur vierge et propre au client. Pour accomplir ces tâches, nous avons implémenté deux modèles distincts fonctionnant via TensorFlow Lite, chargés dès le lancement de l'application grâce à un service dédié afin de les maintenir dans la mémoire vive du téléphone de l'artisan.</w:t>
+        <w:t xml:space="preserve">Le rôle de l'Intelligence Artificielle dans notre application est d'agir comme les « yeux » du système : elle doit d'une part détecter précisément l'autocollant de repère placé sur le mur pour en extraire les coordonnées spatiales, et d'autre part effacer virtuellement cet autocollant de la photographie pour restituer un mur vierge et propre au client. Pour accomplir ces tâches, nous avons implémenté deux modèles distincts fonctionnant via TensorFlow Lite, chargés dès le lancement de </w:t>
+      </w:r>
+      <w:r>
+        <w:lastRenderedPageBreak/>
+        <w:t>l'application grâce à un service dédié afin de les maintenir dans la mémoire vive du téléphone de l'artisan.</w:t>
       </w:r>
     </w:p>
     <w:p>
@@ -4196,7 +4418,7 @@
         <w:spacing w:after="240"/>
         <w:jc w:val="both"/>
       </w:pPr>
-      <w:bookmarkStart w:id="10" w:name="_Toc230338116"/>
+      <w:bookmarkStart w:id="10" w:name="_Toc231375593"/>
       <w:r>
         <w:t>IA pour la Détection de l’Autocollant</w:t>
       </w:r>
@@ -4214,11 +4436,7 @@
         <w:t xml:space="preserve"> </w:t>
       </w:r>
       <w:r>
-        <w:t xml:space="preserve">YOLOv8 entraîné spécifiquement pour détecter notre autocollant. Cependant, pour que ce modèle soit performant et adapté à notre environnement technique spécifique, nous n'avons pas pu </w:t>
-      </w:r>
-      <w:r>
-        <w:lastRenderedPageBreak/>
-        <w:t>nous reposer sur des modèles pré-entraînés standards</w:t>
+        <w:t>YOLOv8 entraîné spécifiquement pour détecter notre autocollant. Cependant, pour que ce modèle soit performant et adapté à notre environnement technique spécifique, nous n'avons pas pu nous reposer sur des modèles pré-entraînés standards</w:t>
       </w:r>
       <w:r>
         <w:t>, i</w:t>
@@ -4230,7 +4448,13 @@
         <w:t>une</w:t>
       </w:r>
       <w:r>
-        <w:t xml:space="preserve"> centaines de photographies de l'autocollant dans diverses conditions d'éclairage, d</w:t>
+        <w:t xml:space="preserve"> </w:t>
+      </w:r>
+      <w:r>
+        <w:t>cinquantaine</w:t>
+      </w:r>
+      <w:r>
+        <w:t xml:space="preserve"> de photographies de l'autocollant dans diverses conditions d'éclairage, d</w:t>
       </w:r>
       <w:r>
         <w:t>e contraste</w:t>
@@ -4333,7 +4557,7 @@
           </mc:Choice>
           <mc:Fallback>
             <w:pict>
-              <v:shape w14:anchorId="43ED134F" id="Zone de texte 2" o:spid="_x0000_s1028" type="#_x0000_t202" style="position:absolute;left:0;text-align:left;margin-left:-.05pt;margin-top:331.15pt;width:452.4pt;height:26.4pt;z-index:251673600;visibility:visible;mso-wrap-style:square;mso-width-percent:0;mso-height-percent:0;mso-wrap-distance-left:9pt;mso-wrap-distance-top:3.6pt;mso-wrap-distance-right:9pt;mso-wrap-distance-bottom:3.6pt;mso-position-horizontal:absolute;mso-position-horizontal-relative:margin;mso-position-vertical:absolute;mso-position-vertical-relative:text;mso-width-percent:0;mso-height-percent:0;mso-width-relative:margin;mso-height-relative:margin;v-text-anchor:top" o:gfxdata="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">
+              <v:shape w14:anchorId="43ED134F" id="_x0000_s1029" type="#_x0000_t202" style="position:absolute;left:0;text-align:left;margin-left:-.05pt;margin-top:331.15pt;width:452.4pt;height:26.4pt;z-index:251673600;visibility:visible;mso-wrap-style:square;mso-width-percent:0;mso-height-percent:0;mso-wrap-distance-left:9pt;mso-wrap-distance-top:3.6pt;mso-wrap-distance-right:9pt;mso-wrap-distance-bottom:3.6pt;mso-position-horizontal:absolute;mso-position-horizontal-relative:margin;mso-position-vertical:absolute;mso-position-vertical-relative:text;mso-width-percent:0;mso-height-percent:0;mso-width-relative:margin;mso-height-relative:margin;v-text-anchor:top" o:gfxdata="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">
                 <v:textbox>
                   <w:txbxContent>
                     <w:p>
@@ -4359,6 +4583,9 @@
         </mc:AlternateContent>
       </w:r>
       <w:r>
+        <w:rPr>
+          <w:noProof/>
+        </w:rPr>
         <w:drawing>
           <wp:anchor distT="0" distB="0" distL="114300" distR="114300" simplePos="0" relativeHeight="251671552" behindDoc="0" locked="0" layoutInCell="1" allowOverlap="1" wp14:anchorId="3A277ABE" wp14:editId="6AFE9AEA">
             <wp:simplePos x="0" y="0"/>
@@ -4383,7 +4610,7 @@
                     <pic:cNvPicPr/>
                   </pic:nvPicPr>
                   <pic:blipFill>
-                    <a:blip r:embed="rId9" cstate="print">
+                    <a:blip r:embed="rId10" cstate="print">
                       <a:extLst>
                         <a:ext uri="{28A0092B-C50C-407E-A947-70E740481C1C}">
                           <a14:useLocalDpi xmlns:a14="http://schemas.microsoft.com/office/drawing/2010/main" val="0"/>
@@ -4455,7 +4682,11 @@
         <w:jc w:val="both"/>
       </w:pPr>
       <w:r>
-        <w:t>Une fois le modèle entraîné, la principale difficulté technique rencontrée côté code a résidé dans la préparation et la manipulation des données brutes de l'appareil photo du smartphone. Les photographies capturées étant d'une résolution très élevée, il a fallu concevoir un algorithme de prétraitement robuste pour redimensionner l'image au format strict requis par YOLO (une matrice de 1024x1024 pixels) et normaliser les valeurs colorimétriques. De plus, pour s'assurer que notre application puisse s'adapter aux différentes architectures matérielles des téléphones (iOS, Android), il a fallu coder une logique capable de gérer dynamiquement l'ordre des canaux de la matrice (formats NHWC ou NCHW).</w:t>
+        <w:t xml:space="preserve">Une fois le modèle entraîné, la principale difficulté technique rencontrée côté code a résidé dans la préparation et la manipulation des données brutes de l'appareil photo du smartphone. Les photographies capturées étant d'une résolution très élevée, il a fallu concevoir un algorithme de prétraitement robuste pour redimensionner l'image au format strict requis par YOLO (une matrice de 1024x1024 pixels) et normaliser les valeurs colorimétriques. De plus, pour s'assurer que notre </w:t>
+      </w:r>
+      <w:r>
+        <w:lastRenderedPageBreak/>
+        <w:t>application puisse s'adapter aux différentes architectures matérielles des téléphones (iOS, Android), il a fallu coder une logique capable de gérer dynamiquement l'ordre des canaux de la matrice (formats NHWC ou NCHW).</w:t>
       </w:r>
     </w:p>
     <w:p>
@@ -4464,11 +4695,7 @@
         <w:jc w:val="both"/>
       </w:pPr>
       <w:r>
-        <w:t xml:space="preserve">Le post-traitement des résultats a également présenté son lot de défis. Il a fallu trier rigoureusement les quatre points de détection fournis par l'IA à l'aide de formules mathématiques pour garantir que l'ordre (haut-gauche, haut-droit, bas-droit, bas-gauche) soit toujours exact. Sans ce tri géométrique, les calculs de perspective ultérieurs auraient généré des équipements inversés ou </w:t>
-      </w:r>
-      <w:r>
-        <w:lastRenderedPageBreak/>
-        <w:t>tordus (</w:t>
+        <w:t>Le post-traitement des résultats a également présenté son lot de défis. Il a fallu trier rigoureusement les quatre points de détection fournis par l'IA à l'aide de formules mathématiques pour garantir que l'ordre (haut-gauche, haut-droit, bas-droit, bas-gauche) soit toujours exact. Sans ce tri géométrique, les calculs de perspective ultérieurs auraient généré des équipements inversés ou tordus (</w:t>
       </w:r>
       <w:r>
         <w:t>A</w:t>
@@ -4501,7 +4728,7 @@
         <w:spacing w:after="240"/>
         <w:jc w:val="both"/>
       </w:pPr>
-      <w:bookmarkStart w:id="11" w:name="_Toc230338117"/>
+      <w:bookmarkStart w:id="11" w:name="_Toc231375594"/>
       <w:r>
         <w:t>Inpainting pour Effacer l’Autocollant du Mur</w:t>
       </w:r>
@@ -4655,7 +4882,7 @@
           </mc:Choice>
           <mc:Fallback>
             <w:pict>
-              <v:shape w14:anchorId="7949ACDC" id="_x0000_s1029" type="#_x0000_t202" style="position:absolute;left:0;text-align:left;margin-left:0;margin-top:260.05pt;width:452.4pt;height:22.8pt;z-index:251677696;visibility:visible;mso-wrap-style:square;mso-width-percent:0;mso-height-percent:0;mso-wrap-distance-left:9pt;mso-wrap-distance-top:3.6pt;mso-wrap-distance-right:9pt;mso-wrap-distance-bottom:3.6pt;mso-position-horizontal:left;mso-position-horizontal-relative:margin;mso-position-vertical:absolute;mso-position-vertical-relative:text;mso-width-percent:0;mso-height-percent:0;mso-width-relative:margin;mso-height-relative:margin;v-text-anchor:top" o:gfxdata="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">
+              <v:shape w14:anchorId="7949ACDC" id="_x0000_s1030" type="#_x0000_t202" style="position:absolute;left:0;text-align:left;margin-left:0;margin-top:260.05pt;width:452.4pt;height:22.8pt;z-index:251677696;visibility:visible;mso-wrap-style:square;mso-width-percent:0;mso-height-percent:0;mso-wrap-distance-left:9pt;mso-wrap-distance-top:3.6pt;mso-wrap-distance-right:9pt;mso-wrap-distance-bottom:3.6pt;mso-position-horizontal:left;mso-position-horizontal-relative:margin;mso-position-vertical:absolute;mso-position-vertical-relative:text;mso-width-percent:0;mso-height-percent:0;mso-width-relative:margin;mso-height-relative:margin;v-text-anchor:top" o:gfxdata="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">
                 <v:textbox>
                   <w:txbxContent>
                     <w:p>
@@ -4681,8 +4908,11 @@
         </mc:AlternateContent>
       </w:r>
       <w:r>
+        <w:rPr>
+          <w:noProof/>
+        </w:rPr>
         <w:drawing>
-          <wp:anchor distT="0" distB="0" distL="114300" distR="114300" simplePos="0" relativeHeight="251675648" behindDoc="0" locked="0" layoutInCell="1" allowOverlap="1" wp14:anchorId="44934B2D" wp14:editId="6573DB1B">
+          <wp:anchor distT="0" distB="0" distL="114300" distR="114300" simplePos="0" relativeHeight="251675648" behindDoc="0" locked="0" layoutInCell="1" allowOverlap="1" wp14:anchorId="44934B2D" wp14:editId="028114E9">
             <wp:simplePos x="0" y="0"/>
             <wp:positionH relativeFrom="margin">
               <wp:align>right</wp:align>
@@ -4707,7 +4937,7 @@
                     </pic:cNvPicPr>
                   </pic:nvPicPr>
                   <pic:blipFill>
-                    <a:blip r:embed="rId10" cstate="print">
+                    <a:blip r:embed="rId11" cstate="print">
                       <a:extLst>
                         <a:ext uri="{28A0092B-C50C-407E-A947-70E740481C1C}">
                           <a14:useLocalDpi xmlns:a14="http://schemas.microsoft.com/office/drawing/2010/main" val="0"/>
@@ -4774,7 +5004,7 @@
                     </pic:cNvPicPr>
                   </pic:nvPicPr>
                   <pic:blipFill>
-                    <a:blip r:embed="rId11" cstate="print">
+                    <a:blip r:embed="rId12" cstate="print">
                       <a:extLst>
                         <a:ext uri="{28A0092B-C50C-407E-A947-70E740481C1C}">
                           <a14:useLocalDpi xmlns:a14="http://schemas.microsoft.com/office/drawing/2010/main" val="0"/>
@@ -4821,7 +5051,7 @@
         <w:spacing w:after="240"/>
         <w:jc w:val="both"/>
       </w:pPr>
-      <w:bookmarkStart w:id="12" w:name="_Toc230338118"/>
+      <w:bookmarkStart w:id="12" w:name="_Toc231375595"/>
       <w:r>
         <w:t>Traitement OpenCV</w:t>
       </w:r>
@@ -4842,7 +5072,7 @@
         <w:spacing w:after="240"/>
         <w:jc w:val="both"/>
       </w:pPr>
-      <w:bookmarkStart w:id="13" w:name="_Toc230338119"/>
+      <w:bookmarkStart w:id="13" w:name="_Toc231375596"/>
       <w:r>
         <w:t xml:space="preserve">Projection </w:t>
       </w:r>
@@ -4906,7 +5136,7 @@
                     </pic:cNvPicPr>
                   </pic:nvPicPr>
                   <pic:blipFill>
-                    <a:blip r:embed="rId12" cstate="print">
+                    <a:blip r:embed="rId13" cstate="print">
                       <a:extLst>
                         <a:ext uri="{28A0092B-C50C-407E-A947-70E740481C1C}">
                           <a14:useLocalDpi xmlns:a14="http://schemas.microsoft.com/office/drawing/2010/main" val="0"/>
@@ -5025,7 +5255,7 @@
           </mc:Choice>
           <mc:Fallback>
             <w:pict>
-              <v:shape w14:anchorId="0737E823" id="_x0000_s1030" type="#_x0000_t202" style="position:absolute;left:0;text-align:left;margin-left:229pt;margin-top:204.5pt;width:280.2pt;height:36pt;z-index:251666432;visibility:visible;mso-wrap-style:square;mso-width-percent:0;mso-height-percent:0;mso-wrap-distance-left:9pt;mso-wrap-distance-top:3.6pt;mso-wrap-distance-right:9pt;mso-wrap-distance-bottom:3.6pt;mso-position-horizontal:right;mso-position-horizontal-relative:margin;mso-position-vertical:absolute;mso-position-vertical-relative:text;mso-width-percent:0;mso-height-percent:0;mso-width-relative:margin;mso-height-relative:margin;v-text-anchor:top" o:gfxdata="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">
+              <v:shape w14:anchorId="0737E823" id="_x0000_s1031" type="#_x0000_t202" style="position:absolute;left:0;text-align:left;margin-left:229pt;margin-top:204.5pt;width:280.2pt;height:36pt;z-index:251666432;visibility:visible;mso-wrap-style:square;mso-width-percent:0;mso-height-percent:0;mso-wrap-distance-left:9pt;mso-wrap-distance-top:3.6pt;mso-wrap-distance-right:9pt;mso-wrap-distance-bottom:3.6pt;mso-position-horizontal:right;mso-position-horizontal-relative:margin;mso-position-vertical:absolute;mso-position-vertical-relative:text;mso-width-percent:0;mso-height-percent:0;mso-width-relative:margin;mso-height-relative:margin;v-text-anchor:top" o:gfxdata="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">
                 <v:textbox>
                   <w:txbxContent>
                     <w:p>
@@ -5102,7 +5332,7 @@
         <w:spacing w:after="240"/>
         <w:jc w:val="both"/>
       </w:pPr>
-      <w:bookmarkStart w:id="14" w:name="_Toc230338120"/>
+      <w:bookmarkStart w:id="14" w:name="_Toc231375597"/>
       <w:r>
         <w:t xml:space="preserve">Éclairage, </w:t>
       </w:r>
@@ -5172,7 +5402,7 @@
         <w:spacing w:after="240"/>
         <w:jc w:val="both"/>
       </w:pPr>
-      <w:bookmarkStart w:id="15" w:name="_Toc230338121"/>
+      <w:bookmarkStart w:id="15" w:name="_Toc231375598"/>
       <w:r>
         <w:t xml:space="preserve">Modélisation </w:t>
       </w:r>
@@ -5273,7 +5503,7 @@
                     </pic:cNvPicPr>
                   </pic:nvPicPr>
                   <pic:blipFill>
-                    <a:blip r:embed="rId13" cstate="print">
+                    <a:blip r:embed="rId14" cstate="print">
                       <a:extLst>
                         <a:ext uri="{28A0092B-C50C-407E-A947-70E740481C1C}">
                           <a14:useLocalDpi xmlns:a14="http://schemas.microsoft.com/office/drawing/2010/main" val="0"/>
@@ -5386,7 +5616,7 @@
           </mc:Choice>
           <mc:Fallback>
             <w:pict>
-              <v:shape w14:anchorId="19D0D49E" id="_x0000_s1031" type="#_x0000_t202" style="position:absolute;left:0;text-align:left;margin-left:178pt;margin-top:233pt;width:229.2pt;height:52.2pt;z-index:251669504;visibility:visible;mso-wrap-style:square;mso-width-percent:0;mso-height-percent:0;mso-wrap-distance-left:9pt;mso-wrap-distance-top:3.6pt;mso-wrap-distance-right:9pt;mso-wrap-distance-bottom:3.6pt;mso-position-horizontal:right;mso-position-horizontal-relative:margin;mso-position-vertical:absolute;mso-position-vertical-relative:text;mso-width-percent:0;mso-height-percent:0;mso-width-relative:margin;mso-height-relative:margin;v-text-anchor:top" o:gfxdata="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">
+              <v:shape w14:anchorId="19D0D49E" id="_x0000_s1032" type="#_x0000_t202" style="position:absolute;left:0;text-align:left;margin-left:178pt;margin-top:233pt;width:229.2pt;height:52.2pt;z-index:251669504;visibility:visible;mso-wrap-style:square;mso-width-percent:0;mso-height-percent:0;mso-wrap-distance-left:9pt;mso-wrap-distance-top:3.6pt;mso-wrap-distance-right:9pt;mso-wrap-distance-bottom:3.6pt;mso-position-horizontal:right;mso-position-horizontal-relative:margin;mso-position-vertical:absolute;mso-position-vertical-relative:text;mso-width-percent:0;mso-height-percent:0;mso-width-relative:margin;mso-height-relative:margin;v-text-anchor:top" o:gfxdata="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">
                 <v:textbox>
                   <w:txbxContent>
                     <w:p>
@@ -5463,7 +5693,7 @@
         <w:spacing w:after="240"/>
         <w:jc w:val="both"/>
       </w:pPr>
-      <w:bookmarkStart w:id="16" w:name="_Toc230338122"/>
+      <w:bookmarkStart w:id="16" w:name="_Toc231375599"/>
       <w:r>
         <w:lastRenderedPageBreak/>
         <w:t xml:space="preserve">Création de </w:t>
@@ -5503,7 +5733,7 @@
         <w:spacing w:after="240"/>
         <w:jc w:val="both"/>
       </w:pPr>
-      <w:bookmarkStart w:id="17" w:name="_Toc230338123"/>
+      <w:bookmarkStart w:id="17" w:name="_Toc231375600"/>
       <w:r>
         <w:t>Architecture et Gestion d'État</w:t>
       </w:r>
@@ -5534,6 +5764,72 @@
         <w:jc w:val="both"/>
       </w:pPr>
       <w:r>
+        <w:rPr>
+          <w:noProof/>
+        </w:rPr>
+        <w:drawing>
+          <wp:anchor distT="0" distB="0" distL="114300" distR="114300" simplePos="0" relativeHeight="251682816" behindDoc="0" locked="0" layoutInCell="1" allowOverlap="1" wp14:anchorId="0CB680BB" wp14:editId="0AF5606E">
+            <wp:simplePos x="0" y="0"/>
+            <wp:positionH relativeFrom="margin">
+              <wp:align>right</wp:align>
+            </wp:positionH>
+            <wp:positionV relativeFrom="paragraph">
+              <wp:posOffset>4445</wp:posOffset>
+            </wp:positionV>
+            <wp:extent cx="2008505" cy="4459605"/>
+            <wp:effectExtent l="0" t="0" r="0" b="0"/>
+            <wp:wrapSquare wrapText="bothSides"/>
+            <wp:docPr id="204708052" name="Image 13"/>
+            <wp:cNvGraphicFramePr>
+              <a:graphicFrameLocks xmlns:a="http://schemas.openxmlformats.org/drawingml/2006/main" noChangeAspect="1"/>
+            </wp:cNvGraphicFramePr>
+            <a:graphic xmlns:a="http://schemas.openxmlformats.org/drawingml/2006/main">
+              <a:graphicData uri="http://schemas.openxmlformats.org/drawingml/2006/picture">
+                <pic:pic xmlns:pic="http://schemas.openxmlformats.org/drawingml/2006/picture">
+                  <pic:nvPicPr>
+                    <pic:cNvPr id="204708052" name="Image 13"/>
+                    <pic:cNvPicPr>
+                      <a:picLocks noChangeAspect="1" noChangeArrowheads="1"/>
+                    </pic:cNvPicPr>
+                  </pic:nvPicPr>
+                  <pic:blipFill>
+                    <a:blip r:embed="rId15" cstate="print">
+                      <a:extLst>
+                        <a:ext uri="{28A0092B-C50C-407E-A947-70E740481C1C}">
+                          <a14:useLocalDpi xmlns:a14="http://schemas.microsoft.com/office/drawing/2010/main" val="0"/>
+                        </a:ext>
+                      </a:extLst>
+                    </a:blip>
+                    <a:stretch>
+                      <a:fillRect/>
+                    </a:stretch>
+                  </pic:blipFill>
+                  <pic:spPr bwMode="auto">
+                    <a:xfrm>
+                      <a:off x="0" y="0"/>
+                      <a:ext cx="2008505" cy="4459605"/>
+                    </a:xfrm>
+                    <a:prstGeom prst="rect">
+                      <a:avLst/>
+                    </a:prstGeom>
+                    <a:noFill/>
+                    <a:ln>
+                      <a:noFill/>
+                    </a:ln>
+                  </pic:spPr>
+                </pic:pic>
+              </a:graphicData>
+            </a:graphic>
+            <wp14:sizeRelH relativeFrom="margin">
+              <wp14:pctWidth>0</wp14:pctWidth>
+            </wp14:sizeRelH>
+            <wp14:sizeRelV relativeFrom="margin">
+              <wp14:pctHeight>0</wp14:pctHeight>
+            </wp14:sizeRelV>
+          </wp:anchor>
+        </w:drawing>
+      </w:r>
+      <w:r>
         <w:t xml:space="preserve">En parallèle, l'interface utilisateur a été optimisée via l'utilisation de </w:t>
       </w:r>
       <w:r>
@@ -5553,7 +5849,7 @@
         <w:spacing w:after="240"/>
         <w:jc w:val="both"/>
       </w:pPr>
-      <w:bookmarkStart w:id="18" w:name="_Toc230338124"/>
+      <w:bookmarkStart w:id="18" w:name="_Toc231375601"/>
       <w:r>
         <w:t>Outil de Capture Gyroscopique</w:t>
       </w:r>
@@ -5588,37 +5884,11 @@
       <w:r>
         <w:t>.</w:t>
       </w:r>
-    </w:p>
-    <w:p>
-      <w:pPr>
-        <w:jc w:val="both"/>
-      </w:pPr>
       <w:r>
         <w:rPr>
-          <w:b/>
-          <w:bCs/>
+          <w:noProof/>
         </w:rPr>
-        <w:t>[Figure]</w:t>
-      </w:r>
-      <w:r>
-        <w:t xml:space="preserve"> : </w:t>
-      </w:r>
-      <w:r>
-        <w:rPr>
-          <w:i/>
-          <w:iCs/>
-        </w:rPr>
-        <w:t>Idée d'image : Une capture de l'écran d'accueil montrant la vue caméra avec le niveau à bulle au centre (idéalement quand la bulle est verte pour montrer l'alignement).</w:t>
-      </w:r>
-      <w:r>
         <w:t xml:space="preserve"> </w:t>
-      </w:r>
-      <w:r>
-        <w:rPr>
-          <w:i/>
-          <w:iCs/>
-        </w:rPr>
-        <w:t>Légende : « Interface de capture intégrant un niveau à bulle gyroscopique pour garantir l'orthogonalité de la photographie. »</w:t>
       </w:r>
     </w:p>
     <w:p>
@@ -5627,7 +5897,7 @@
         <w:spacing w:after="240"/>
         <w:jc w:val="both"/>
       </w:pPr>
-      <w:bookmarkStart w:id="19" w:name="_Toc230338125"/>
+      <w:bookmarkStart w:id="19" w:name="_Toc231375602"/>
       <w:r>
         <w:lastRenderedPageBreak/>
         <w:t>Incrustation des Goulottes</w:t>
@@ -5669,7 +5939,7 @@
                     </pic:cNvPicPr>
                   </pic:nvPicPr>
                   <pic:blipFill>
-                    <a:blip r:embed="rId14" cstate="print">
+                    <a:blip r:embed="rId16" cstate="print">
                       <a:extLst>
                         <a:ext uri="{28A0092B-C50C-407E-A947-70E740481C1C}">
                           <a14:useLocalDpi xmlns:a14="http://schemas.microsoft.com/office/drawing/2010/main" val="0"/>
@@ -5748,7 +6018,7 @@
         <w:spacing w:after="240"/>
         <w:jc w:val="both"/>
       </w:pPr>
-      <w:bookmarkStart w:id="20" w:name="_Toc230338126"/>
+      <w:bookmarkStart w:id="20" w:name="_Toc231375603"/>
       <w:r>
         <w:t>Interface Utilisateur</w:t>
       </w:r>
@@ -5781,7 +6051,7 @@
         <w:spacing w:after="240"/>
         <w:jc w:val="both"/>
       </w:pPr>
-      <w:bookmarkStart w:id="21" w:name="_Toc230338127"/>
+      <w:bookmarkStart w:id="21" w:name="_Toc231375604"/>
       <w:r>
         <w:lastRenderedPageBreak/>
         <w:t>Perspective d’Amélioration</w:t>
@@ -5827,7 +6097,7 @@
         <w:spacing w:after="240"/>
         <w:jc w:val="both"/>
       </w:pPr>
-      <w:bookmarkStart w:id="22" w:name="_Toc230338128"/>
+      <w:bookmarkStart w:id="22" w:name="_Toc231375605"/>
       <w:r>
         <w:t>Conclusion</w:t>
       </w:r>
@@ -5883,10 +6153,10 @@
       </w:r>
     </w:p>
     <w:sectPr>
-      <w:headerReference w:type="even" r:id="rId15"/>
-      <w:headerReference w:type="default" r:id="rId16"/>
-      <w:footerReference w:type="even" r:id="rId17"/>
-      <w:footerReference w:type="default" r:id="rId18"/>
+      <w:headerReference w:type="even" r:id="rId17"/>
+      <w:headerReference w:type="default" r:id="rId18"/>
+      <w:footerReference w:type="even" r:id="rId19"/>
+      <w:footerReference w:type="default" r:id="rId20"/>
       <w:pgSz w:w="11906" w:h="16838"/>
       <w:pgMar w:top="1417" w:right="1417" w:bottom="1417" w:left="1417" w:header="708" w:footer="708" w:gutter="0"/>
       <w:pgNumType w:start="0"/>

</xml_diff>